<commit_message>
Tidy Section 5.1 bin table layout in condensed midterm submittal
Co-Authored-By: Claude Opus 5.5 <noreply@anthropic.com>
Claude-Session: https://claude.ai/code/session_012JJXwfwyiQpVmeBgaZESyh
</commit_message>
<xml_diff>
--- a/docs/aeee5250-wind-midterm/Wind_Project_Midterm_Final_Submittal_CONDENSED.docx
+++ b/docs/aeee5250-wind-midterm/Wind_Project_Midterm_Final_Submittal_CONDENSED.docx
@@ -258,6 +258,7 @@
           </w:tcPr>
           <w:p>
             <w:pPr>
+              <w:keepNext/>
               <w:jc w:val="center"/>
               <w:rPr/>
             </w:pPr>
@@ -297,6 +298,7 @@
           </w:tcPr>
           <w:p>
             <w:pPr>
+              <w:keepNext/>
               <w:jc w:val="center"/>
               <w:rPr/>
             </w:pPr>
@@ -336,6 +338,7 @@
           </w:tcPr>
           <w:p>
             <w:pPr>
+              <w:keepNext/>
               <w:jc w:val="center"/>
               <w:rPr/>
             </w:pPr>
@@ -380,6 +383,7 @@
           </w:tcPr>
           <w:p>
             <w:pPr>
+              <w:keepNext/>
               <w:jc w:val="center"/>
               <w:rPr/>
             </w:pPr>
@@ -415,6 +419,7 @@
           </w:tcPr>
           <w:p>
             <w:pPr>
+              <w:keepNext/>
               <w:jc w:val="center"/>
               <w:rPr/>
             </w:pPr>
@@ -450,6 +455,7 @@
           </w:tcPr>
           <w:p>
             <w:pPr>
+              <w:keepNext/>
               <w:jc w:val="center"/>
               <w:rPr/>
             </w:pPr>
@@ -491,6 +497,7 @@
           </w:tcPr>
           <w:p>
             <w:pPr>
+              <w:keepNext/>
               <w:jc w:val="center"/>
               <w:rPr/>
             </w:pPr>
@@ -526,6 +533,7 @@
           </w:tcPr>
           <w:p>
             <w:pPr>
+              <w:keepNext/>
               <w:jc w:val="center"/>
               <w:rPr/>
             </w:pPr>
@@ -561,6 +569,7 @@
           </w:tcPr>
           <w:p>
             <w:pPr>
+              <w:keepNext/>
               <w:jc w:val="center"/>
               <w:rPr/>
             </w:pPr>
@@ -602,6 +611,7 @@
           </w:tcPr>
           <w:p>
             <w:pPr>
+              <w:keepNext/>
               <w:jc w:val="center"/>
               <w:rPr/>
             </w:pPr>
@@ -637,6 +647,7 @@
           </w:tcPr>
           <w:p>
             <w:pPr>
+              <w:keepNext/>
               <w:jc w:val="center"/>
               <w:rPr/>
             </w:pPr>
@@ -672,6 +683,7 @@
           </w:tcPr>
           <w:p>
             <w:pPr>
+              <w:keepNext/>
               <w:jc w:val="center"/>
               <w:rPr/>
             </w:pPr>
@@ -713,6 +725,7 @@
           </w:tcPr>
           <w:p>
             <w:pPr>
+              <w:keepNext/>
               <w:jc w:val="center"/>
               <w:rPr/>
             </w:pPr>
@@ -748,6 +761,7 @@
           </w:tcPr>
           <w:p>
             <w:pPr>
+              <w:keepNext/>
               <w:jc w:val="center"/>
               <w:rPr/>
             </w:pPr>
@@ -783,6 +797,7 @@
           </w:tcPr>
           <w:p>
             <w:pPr>
+              <w:keepNext/>
               <w:jc w:val="center"/>
               <w:rPr/>
             </w:pPr>
@@ -824,6 +839,7 @@
           </w:tcPr>
           <w:p>
             <w:pPr>
+              <w:keepNext/>
               <w:jc w:val="center"/>
               <w:rPr/>
             </w:pPr>
@@ -859,6 +875,7 @@
           </w:tcPr>
           <w:p>
             <w:pPr>
+              <w:keepNext/>
               <w:jc w:val="center"/>
               <w:rPr/>
             </w:pPr>
@@ -894,6 +911,7 @@
           </w:tcPr>
           <w:p>
             <w:pPr>
+              <w:keepNext/>
               <w:jc w:val="center"/>
               <w:rPr/>
             </w:pPr>
@@ -1034,6 +1052,7 @@
           </w:tcPr>
           <w:p>
             <w:pPr>
+              <w:keepNext/>
               <w:jc w:val="center"/>
               <w:rPr/>
             </w:pPr>
@@ -1073,6 +1092,7 @@
           </w:tcPr>
           <w:p>
             <w:pPr>
+              <w:keepNext/>
               <w:jc w:val="center"/>
               <w:rPr/>
             </w:pPr>
@@ -1112,6 +1132,7 @@
           </w:tcPr>
           <w:p>
             <w:pPr>
+              <w:keepNext/>
               <w:jc w:val="center"/>
               <w:rPr/>
             </w:pPr>
@@ -1151,6 +1172,7 @@
           </w:tcPr>
           <w:p>
             <w:pPr>
+              <w:keepNext/>
               <w:jc w:val="center"/>
               <w:rPr/>
             </w:pPr>
@@ -1195,6 +1217,7 @@
           </w:tcPr>
           <w:p>
             <w:pPr>
+              <w:keepNext/>
               <w:jc w:val="right"/>
               <w:rPr/>
             </w:pPr>
@@ -1230,6 +1253,7 @@
           </w:tcPr>
           <w:p>
             <w:pPr>
+              <w:keepNext/>
               <w:jc w:val="center"/>
               <w:rPr/>
             </w:pPr>
@@ -1260,6 +1284,7 @@
           </w:tcPr>
           <w:p>
             <w:pPr>
+              <w:keepNext/>
               <w:jc w:val="center"/>
               <w:rPr/>
             </w:pPr>
@@ -1290,6 +1315,7 @@
           </w:tcPr>
           <w:p>
             <w:pPr>
+              <w:keepNext/>
               <w:jc w:val="center"/>
               <w:rPr/>
             </w:pPr>
@@ -1326,6 +1352,7 @@
           </w:tcPr>
           <w:p>
             <w:pPr>
+              <w:keepNext/>
               <w:jc w:val="right"/>
               <w:rPr/>
             </w:pPr>
@@ -1361,6 +1388,7 @@
           </w:tcPr>
           <w:p>
             <w:pPr>
+              <w:keepNext/>
               <w:jc w:val="center"/>
               <w:rPr/>
             </w:pPr>
@@ -1389,6 +1417,7 @@
           </w:tcPr>
           <w:p>
             <w:pPr>
+              <w:keepNext/>
               <w:jc w:val="center"/>
               <w:rPr/>
             </w:pPr>
@@ -1417,6 +1446,7 @@
           </w:tcPr>
           <w:p>
             <w:pPr>
+              <w:keepNext/>
               <w:jc w:val="center"/>
               <w:rPr/>
             </w:pPr>
@@ -1451,6 +1481,7 @@
           </w:tcPr>
           <w:p>
             <w:pPr>
+              <w:keepNext/>
               <w:jc w:val="right"/>
               <w:rPr/>
             </w:pPr>
@@ -1486,6 +1517,7 @@
           </w:tcPr>
           <w:p>
             <w:pPr>
+              <w:keepNext/>
               <w:jc w:val="center"/>
               <w:rPr/>
             </w:pPr>
@@ -1514,6 +1546,7 @@
           </w:tcPr>
           <w:p>
             <w:pPr>
+              <w:keepNext/>
               <w:jc w:val="center"/>
               <w:rPr/>
             </w:pPr>
@@ -1542,6 +1575,7 @@
           </w:tcPr>
           <w:p>
             <w:pPr>
+              <w:keepNext/>
               <w:jc w:val="center"/>
               <w:rPr/>
             </w:pPr>
@@ -1576,6 +1610,7 @@
           </w:tcPr>
           <w:p>
             <w:pPr>
+              <w:keepNext/>
               <w:jc w:val="right"/>
               <w:rPr/>
             </w:pPr>
@@ -1611,6 +1646,7 @@
           </w:tcPr>
           <w:p>
             <w:pPr>
+              <w:keepNext/>
               <w:jc w:val="center"/>
               <w:rPr/>
             </w:pPr>
@@ -1639,6 +1675,7 @@
           </w:tcPr>
           <w:p>
             <w:pPr>
+              <w:keepNext/>
               <w:jc w:val="center"/>
               <w:rPr/>
             </w:pPr>
@@ -1667,6 +1704,7 @@
           </w:tcPr>
           <w:p>
             <w:pPr>
+              <w:keepNext/>
               <w:jc w:val="center"/>
               <w:rPr/>
             </w:pPr>
@@ -1701,6 +1739,7 @@
           </w:tcPr>
           <w:p>
             <w:pPr>
+              <w:keepNext/>
               <w:jc w:val="right"/>
               <w:rPr/>
             </w:pPr>
@@ -1736,6 +1775,7 @@
           </w:tcPr>
           <w:p>
             <w:pPr>
+              <w:keepNext/>
               <w:jc w:val="center"/>
               <w:rPr/>
             </w:pPr>
@@ -1764,6 +1804,7 @@
           </w:tcPr>
           <w:p>
             <w:pPr>
+              <w:keepNext/>
               <w:jc w:val="center"/>
               <w:rPr/>
             </w:pPr>
@@ -1792,6 +1833,7 @@
           </w:tcPr>
           <w:p>
             <w:pPr>
+              <w:keepNext/>
               <w:jc w:val="center"/>
               <w:rPr/>
             </w:pPr>
@@ -1826,6 +1868,7 @@
           </w:tcPr>
           <w:p>
             <w:pPr>
+              <w:keepNext/>
               <w:jc w:val="right"/>
               <w:rPr/>
             </w:pPr>
@@ -1861,6 +1904,7 @@
           </w:tcPr>
           <w:p>
             <w:pPr>
+              <w:keepNext/>
               <w:jc w:val="center"/>
               <w:rPr/>
             </w:pPr>
@@ -1889,6 +1933,7 @@
           </w:tcPr>
           <w:p>
             <w:pPr>
+              <w:keepNext/>
               <w:jc w:val="center"/>
               <w:rPr/>
             </w:pPr>
@@ -1917,6 +1962,7 @@
           </w:tcPr>
           <w:p>
             <w:pPr>
+              <w:keepNext/>
               <w:jc w:val="center"/>
               <w:rPr/>
             </w:pPr>
@@ -1951,6 +1997,7 @@
           </w:tcPr>
           <w:p>
             <w:pPr>
+              <w:keepNext/>
               <w:jc w:val="right"/>
               <w:rPr/>
             </w:pPr>
@@ -1986,6 +2033,7 @@
           </w:tcPr>
           <w:p>
             <w:pPr>
+              <w:keepNext/>
               <w:jc w:val="center"/>
               <w:rPr/>
             </w:pPr>
@@ -2014,6 +2062,7 @@
           </w:tcPr>
           <w:p>
             <w:pPr>
+              <w:keepNext/>
               <w:jc w:val="center"/>
               <w:rPr/>
             </w:pPr>
@@ -2042,6 +2091,7 @@
           </w:tcPr>
           <w:p>
             <w:pPr>
+              <w:keepNext/>
               <w:jc w:val="center"/>
               <w:rPr/>
             </w:pPr>
@@ -2076,6 +2126,7 @@
           </w:tcPr>
           <w:p>
             <w:pPr>
+              <w:keepNext/>
               <w:jc w:val="right"/>
               <w:rPr/>
             </w:pPr>
@@ -2111,6 +2162,7 @@
           </w:tcPr>
           <w:p>
             <w:pPr>
+              <w:keepNext/>
               <w:jc w:val="center"/>
               <w:rPr/>
             </w:pPr>
@@ -2139,6 +2191,7 @@
           </w:tcPr>
           <w:p>
             <w:pPr>
+              <w:keepNext/>
               <w:jc w:val="center"/>
               <w:rPr/>
             </w:pPr>
@@ -2167,6 +2220,7 @@
           </w:tcPr>
           <w:p>
             <w:pPr>
+              <w:keepNext/>
               <w:jc w:val="center"/>
               <w:rPr/>
             </w:pPr>
@@ -2451,6 +2505,7 @@
           </w:tcPr>
           <w:p>
             <w:pPr>
+              <w:keepNext/>
               <w:rPr/>
             </w:pPr>
             <w:r>
@@ -2489,6 +2544,7 @@
           </w:tcPr>
           <w:p>
             <w:pPr>
+              <w:keepNext/>
               <w:rPr/>
             </w:pPr>
             <w:r>
@@ -2527,6 +2583,7 @@
           </w:tcPr>
           <w:p>
             <w:pPr>
+              <w:keepNext/>
               <w:rPr/>
             </w:pPr>
             <w:r>
@@ -2570,6 +2627,7 @@
           </w:tcPr>
           <w:p>
             <w:pPr>
+              <w:keepNext/>
               <w:rPr/>
             </w:pPr>
             <w:r>
@@ -2604,6 +2662,7 @@
           </w:tcPr>
           <w:p>
             <w:pPr>
+              <w:keepNext/>
               <w:rPr/>
             </w:pPr>
             <w:r>
@@ -2631,6 +2690,7 @@
           </w:tcPr>
           <w:p>
             <w:pPr>
+              <w:keepNext/>
               <w:rPr/>
             </w:pPr>
             <w:r>
@@ -2671,6 +2731,7 @@
           </w:tcPr>
           <w:p>
             <w:pPr>
+              <w:keepNext/>
               <w:rPr/>
             </w:pPr>
             <w:r>
@@ -2705,6 +2766,7 @@
           </w:tcPr>
           <w:p>
             <w:pPr>
+              <w:keepNext/>
               <w:rPr/>
             </w:pPr>
             <w:r>
@@ -2732,6 +2794,7 @@
           </w:tcPr>
           <w:p>
             <w:pPr>
+              <w:keepNext/>
               <w:rPr/>
             </w:pPr>
             <w:r>
@@ -2772,6 +2835,7 @@
           </w:tcPr>
           <w:p>
             <w:pPr>
+              <w:keepNext/>
               <w:rPr/>
             </w:pPr>
             <w:r>
@@ -2806,6 +2870,7 @@
           </w:tcPr>
           <w:p>
             <w:pPr>
+              <w:keepNext/>
               <w:rPr/>
             </w:pPr>
             <w:r>
@@ -2833,6 +2898,7 @@
           </w:tcPr>
           <w:p>
             <w:pPr>
+              <w:keepNext/>
               <w:rPr/>
             </w:pPr>
             <w:r>
@@ -2873,6 +2939,7 @@
           </w:tcPr>
           <w:p>
             <w:pPr>
+              <w:keepNext/>
               <w:rPr/>
             </w:pPr>
             <w:r>
@@ -2907,6 +2974,7 @@
           </w:tcPr>
           <w:p>
             <w:pPr>
+              <w:keepNext/>
               <w:rPr/>
             </w:pPr>
             <w:r>
@@ -2934,6 +3002,7 @@
           </w:tcPr>
           <w:p>
             <w:pPr>
+              <w:keepNext/>
               <w:rPr/>
             </w:pPr>
             <w:r>
@@ -2974,6 +3043,7 @@
           </w:tcPr>
           <w:p>
             <w:pPr>
+              <w:keepNext/>
               <w:rPr/>
             </w:pPr>
             <w:r>
@@ -3008,6 +3078,7 @@
           </w:tcPr>
           <w:p>
             <w:pPr>
+              <w:keepNext/>
               <w:rPr/>
             </w:pPr>
             <w:r>
@@ -3035,6 +3106,7 @@
           </w:tcPr>
           <w:p>
             <w:pPr>
+              <w:keepNext/>
               <w:rPr/>
             </w:pPr>
             <w:r>
@@ -3075,6 +3147,7 @@
           </w:tcPr>
           <w:p>
             <w:pPr>
+              <w:keepNext/>
               <w:rPr/>
             </w:pPr>
             <w:r>
@@ -3109,6 +3182,7 @@
           </w:tcPr>
           <w:p>
             <w:pPr>
+              <w:keepNext/>
               <w:rPr/>
             </w:pPr>
             <w:r>
@@ -3136,6 +3210,7 @@
           </w:tcPr>
           <w:p>
             <w:pPr>
+              <w:keepNext/>
               <w:rPr/>
             </w:pPr>
             <w:r>
@@ -3176,6 +3251,7 @@
           </w:tcPr>
           <w:p>
             <w:pPr>
+              <w:keepNext/>
               <w:rPr/>
             </w:pPr>
             <w:r>
@@ -3210,6 +3286,7 @@
           </w:tcPr>
           <w:p>
             <w:pPr>
+              <w:keepNext/>
               <w:rPr/>
             </w:pPr>
             <w:r>
@@ -3237,6 +3314,7 @@
           </w:tcPr>
           <w:p>
             <w:pPr>
+              <w:keepNext/>
               <w:rPr/>
             </w:pPr>
             <w:r>
@@ -4610,6 +4688,7 @@
           </w:tcPr>
           <w:p>
             <w:pPr>
+              <w:keepNext/>
               <w:rPr/>
             </w:pPr>
             <w:r>
@@ -4648,6 +4727,7 @@
           </w:tcPr>
           <w:p>
             <w:pPr>
+              <w:keepNext/>
               <w:rPr/>
             </w:pPr>
             <w:r>
@@ -4686,6 +4766,7 @@
           </w:tcPr>
           <w:p>
             <w:pPr>
+              <w:keepNext/>
               <w:rPr/>
             </w:pPr>
             <w:r>
@@ -4724,6 +4805,7 @@
           </w:tcPr>
           <w:p>
             <w:pPr>
+              <w:keepNext/>
               <w:rPr/>
             </w:pPr>
             <w:r>
@@ -4767,6 +4849,7 @@
           </w:tcPr>
           <w:p>
             <w:pPr>
+              <w:keepNext/>
               <w:rPr/>
             </w:pPr>
             <w:r>
@@ -4801,6 +4884,7 @@
           </w:tcPr>
           <w:p>
             <w:pPr>
+              <w:keepNext/>
               <w:rPr/>
             </w:pPr>
             <w:r>
@@ -4835,6 +4919,7 @@
           </w:tcPr>
           <w:p>
             <w:pPr>
+              <w:keepNext/>
               <w:rPr/>
             </w:pPr>
             <w:r>
@@ -4869,6 +4954,7 @@
           </w:tcPr>
           <w:p>
             <w:pPr>
+              <w:keepNext/>
               <w:rPr/>
             </w:pPr>
             <w:r>
@@ -4909,6 +4995,7 @@
           </w:tcPr>
           <w:p>
             <w:pPr>
+              <w:keepNext/>
               <w:rPr/>
             </w:pPr>
             <w:r>
@@ -4943,6 +5030,7 @@
           </w:tcPr>
           <w:p>
             <w:pPr>
+              <w:keepNext/>
               <w:rPr/>
             </w:pPr>
             <w:r>
@@ -4977,6 +5065,7 @@
           </w:tcPr>
           <w:p>
             <w:pPr>
+              <w:keepNext/>
               <w:rPr/>
             </w:pPr>
             <w:r>
@@ -5011,6 +5100,7 @@
           </w:tcPr>
           <w:p>
             <w:pPr>
+              <w:keepNext/>
               <w:rPr/>
             </w:pPr>
             <w:r>
@@ -5051,6 +5141,7 @@
           </w:tcPr>
           <w:p>
             <w:pPr>
+              <w:keepNext/>
               <w:rPr/>
             </w:pPr>
             <w:r>
@@ -5085,6 +5176,7 @@
           </w:tcPr>
           <w:p>
             <w:pPr>
+              <w:keepNext/>
               <w:rPr/>
             </w:pPr>
             <w:r>
@@ -5119,6 +5211,7 @@
           </w:tcPr>
           <w:p>
             <w:pPr>
+              <w:keepNext/>
               <w:rPr/>
             </w:pPr>
             <w:r>
@@ -5153,6 +5246,7 @@
           </w:tcPr>
           <w:p>
             <w:pPr>
+              <w:keepNext/>
               <w:rPr/>
             </w:pPr>
             <w:r>
@@ -5193,6 +5287,7 @@
           </w:tcPr>
           <w:p>
             <w:pPr>
+              <w:keepNext/>
               <w:rPr/>
             </w:pPr>
             <w:r>
@@ -5227,6 +5322,7 @@
           </w:tcPr>
           <w:p>
             <w:pPr>
+              <w:keepNext/>
               <w:rPr/>
             </w:pPr>
             <w:r>
@@ -5261,6 +5357,7 @@
           </w:tcPr>
           <w:p>
             <w:pPr>
+              <w:keepNext/>
               <w:rPr/>
             </w:pPr>
             <w:r>
@@ -5295,6 +5392,7 @@
           </w:tcPr>
           <w:p>
             <w:pPr>
+              <w:keepNext/>
               <w:rPr/>
             </w:pPr>
             <w:r>
@@ -5335,6 +5433,7 @@
           </w:tcPr>
           <w:p>
             <w:pPr>
+              <w:keepNext/>
               <w:rPr/>
             </w:pPr>
             <w:r>
@@ -5369,6 +5468,7 @@
           </w:tcPr>
           <w:p>
             <w:pPr>
+              <w:keepNext/>
               <w:rPr/>
             </w:pPr>
             <w:r>
@@ -5403,6 +5503,7 @@
           </w:tcPr>
           <w:p>
             <w:pPr>
+              <w:keepNext/>
               <w:rPr/>
             </w:pPr>
             <w:r>
@@ -5437,6 +5538,7 @@
           </w:tcPr>
           <w:p>
             <w:pPr>
+              <w:keepNext/>
               <w:rPr/>
             </w:pPr>
             <w:r>
@@ -5477,6 +5579,7 @@
           </w:tcPr>
           <w:p>
             <w:pPr>
+              <w:keepNext/>
               <w:rPr/>
             </w:pPr>
             <w:r>
@@ -5511,6 +5614,7 @@
           </w:tcPr>
           <w:p>
             <w:pPr>
+              <w:keepNext/>
               <w:rPr/>
             </w:pPr>
             <w:r>
@@ -5545,6 +5649,7 @@
           </w:tcPr>
           <w:p>
             <w:pPr>
+              <w:keepNext/>
               <w:rPr/>
             </w:pPr>
             <w:r>
@@ -5579,6 +5684,7 @@
           </w:tcPr>
           <w:p>
             <w:pPr>
+              <w:keepNext/>
               <w:rPr/>
             </w:pPr>
             <w:r>
@@ -5717,6 +5823,7 @@
           </w:tcPr>
           <w:p>
             <w:pPr>
+              <w:keepNext/>
               <w:rPr/>
             </w:pPr>
             <w:r>
@@ -5755,6 +5862,7 @@
           </w:tcPr>
           <w:p>
             <w:pPr>
+              <w:keepNext/>
               <w:rPr/>
             </w:pPr>
             <w:r>
@@ -5798,6 +5906,7 @@
           </w:tcPr>
           <w:p>
             <w:pPr>
+              <w:keepNext/>
               <w:rPr/>
             </w:pPr>
             <w:r>
@@ -5832,6 +5941,7 @@
           </w:tcPr>
           <w:p>
             <w:pPr>
+              <w:keepNext/>
               <w:rPr/>
             </w:pPr>
             <w:r>
@@ -5865,6 +5975,7 @@
           </w:tcPr>
           <w:p>
             <w:pPr>
+              <w:keepNext/>
               <w:rPr/>
             </w:pPr>
             <w:r>
@@ -5899,6 +6010,7 @@
           </w:tcPr>
           <w:p>
             <w:pPr>
+              <w:keepNext/>
               <w:rPr/>
             </w:pPr>
             <w:r>
@@ -5932,6 +6044,7 @@
           </w:tcPr>
           <w:p>
             <w:pPr>
+              <w:keepNext/>
               <w:rPr/>
             </w:pPr>
             <w:r>
@@ -5966,6 +6079,7 @@
           </w:tcPr>
           <w:p>
             <w:pPr>
+              <w:keepNext/>
               <w:rPr/>
             </w:pPr>
             <w:r>
@@ -5999,6 +6113,7 @@
           </w:tcPr>
           <w:p>
             <w:pPr>
+              <w:keepNext/>
               <w:rPr/>
             </w:pPr>
             <w:r>
@@ -6033,6 +6148,7 @@
           </w:tcPr>
           <w:p>
             <w:pPr>
+              <w:keepNext/>
               <w:rPr/>
             </w:pPr>
             <w:r>
@@ -6066,6 +6182,7 @@
           </w:tcPr>
           <w:p>
             <w:pPr>
+              <w:keepNext/>
               <w:rPr/>
             </w:pPr>
             <w:r>
@@ -6100,6 +6217,7 @@
           </w:tcPr>
           <w:p>
             <w:pPr>
+              <w:keepNext/>
               <w:rPr/>
             </w:pPr>
             <w:r>
@@ -6133,6 +6251,7 @@
           </w:tcPr>
           <w:p>
             <w:pPr>
+              <w:keepNext/>
               <w:rPr/>
             </w:pPr>
             <w:r>
@@ -6167,6 +6286,7 @@
           </w:tcPr>
           <w:p>
             <w:pPr>
+              <w:keepNext/>
               <w:rPr/>
             </w:pPr>
             <w:r>
@@ -7549,18 +7669,23 @@
       <w:tblPr>
         <w:tblW w:type="auto" w:w="0"/>
         <w:jc w:val="center"/>
+        <w:tblLayout w:type="fixed"/>
         <w:tblLook w:firstColumn="1" w:firstRow="1" w:lastColumn="0" w:lastRow="0" w:noHBand="0" w:noVBand="1" w:val="04A0"/>
       </w:tblPr>
       <w:tblGrid>
-        <w:gridCol w:w="2340"/>
-        <w:gridCol w:w="2340"/>
-        <w:gridCol w:w="2340"/>
-        <w:gridCol w:w="2340"/>
+        <w:gridCol w:w="892"/>
+        <w:gridCol w:w="1036"/>
+        <w:gridCol w:w="1036"/>
+        <w:gridCol w:w="1152"/>
+        <w:gridCol w:w="892"/>
+        <w:gridCol w:w="1036"/>
+        <w:gridCol w:w="1036"/>
+        <w:gridCol w:w="1152"/>
       </w:tblGrid>
       <w:tr>
         <w:tc>
           <w:tcPr>
-            <w:tcW w:type="dxa" w:w="1584"/>
+            <w:tcW w:type="dxa" w:w="893"/>
             <w:tcBorders>
               <w:top w:val="single" w:sz="4" w:space="0" w:color="000000"/>
               <w:left w:val="single" w:sz="4" w:space="0" w:color="000000"/>
@@ -7577,20 +7702,21 @@
           </w:tcPr>
           <w:p>
             <w:pPr>
+              <w:keepNext/>
               <w:spacing w:after="0"/>
               <w:jc w:val="center"/>
             </w:pPr>
             <w:r>
               <w:rPr>
                 <w:b/>
-                <w:sz w:val="17"/>
+                <w:sz w:val="18"/>
               </w:rPr>
               <w:t>v</w:t>
             </w:r>
             <w:r>
               <w:rPr>
                 <w:b/>
-                <w:sz w:val="17"/>
+                <w:sz w:val="18"/>
                 <w:vertAlign w:val="subscript"/>
               </w:rPr>
               <w:t>i</w:t>
@@ -7598,7 +7724,7 @@
             <w:r>
               <w:rPr>
                 <w:b/>
-                <w:sz w:val="17"/>
+                <w:sz w:val="18"/>
               </w:rPr>
               <w:t xml:space="preserve"> (m/s)</w:t>
             </w:r>
@@ -7606,7 +7732,7 @@
         </w:tc>
         <w:tc>
           <w:tcPr>
-            <w:tcW w:type="dxa" w:w="1584"/>
+            <w:tcW w:type="dxa" w:w="1037"/>
             <w:tcBorders>
               <w:top w:val="single" w:sz="4" w:space="0" w:color="000000"/>
               <w:left w:val="single" w:sz="4" w:space="0" w:color="000000"/>
@@ -7623,20 +7749,21 @@
           </w:tcPr>
           <w:p>
             <w:pPr>
+              <w:keepNext/>
               <w:spacing w:after="0"/>
               <w:jc w:val="center"/>
             </w:pPr>
             <w:r>
               <w:rPr>
                 <w:b/>
-                <w:sz w:val="17"/>
+                <w:sz w:val="18"/>
               </w:rPr>
               <w:t>h</w:t>
             </w:r>
             <w:r>
               <w:rPr>
                 <w:b/>
-                <w:sz w:val="17"/>
+                <w:sz w:val="18"/>
                 <w:vertAlign w:val="subscript"/>
               </w:rPr>
               <w:t>i</w:t>
@@ -7644,7 +7771,7 @@
             <w:r>
               <w:rPr>
                 <w:b/>
-                <w:sz w:val="17"/>
+                <w:sz w:val="18"/>
               </w:rPr>
               <w:t xml:space="preserve"> (h/yr)</w:t>
             </w:r>
@@ -7652,7 +7779,7 @@
         </w:tc>
         <w:tc>
           <w:tcPr>
-            <w:tcW w:type="dxa" w:w="1584"/>
+            <w:tcW w:type="dxa" w:w="1037"/>
             <w:tcBorders>
               <w:top w:val="single" w:sz="4" w:space="0" w:color="000000"/>
               <w:left w:val="single" w:sz="4" w:space="0" w:color="000000"/>
@@ -7669,20 +7796,21 @@
           </w:tcPr>
           <w:p>
             <w:pPr>
+              <w:keepNext/>
               <w:spacing w:after="0"/>
               <w:jc w:val="center"/>
             </w:pPr>
             <w:r>
               <w:rPr>
                 <w:b/>
-                <w:sz w:val="17"/>
+                <w:sz w:val="18"/>
               </w:rPr>
               <w:t>P(v</w:t>
             </w:r>
             <w:r>
               <w:rPr>
                 <w:b/>
-                <w:sz w:val="17"/>
+                <w:sz w:val="18"/>
                 <w:vertAlign w:val="subscript"/>
               </w:rPr>
               <w:t>i</w:t>
@@ -7690,7 +7818,7 @@
             <w:r>
               <w:rPr>
                 <w:b/>
-                <w:sz w:val="17"/>
+                <w:sz w:val="18"/>
               </w:rPr>
               <w:t>) (kW)</w:t>
             </w:r>
@@ -7698,7 +7826,7 @@
         </w:tc>
         <w:tc>
           <w:tcPr>
-            <w:tcW w:type="dxa" w:w="1728"/>
+            <w:tcW w:type="dxa" w:w="1152"/>
             <w:tcBorders>
               <w:top w:val="single" w:sz="4" w:space="0" w:color="000000"/>
               <w:left w:val="single" w:sz="4" w:space="0" w:color="000000"/>
@@ -7715,20 +7843,21 @@
           </w:tcPr>
           <w:p>
             <w:pPr>
+              <w:keepNext/>
               <w:spacing w:after="0"/>
               <w:jc w:val="center"/>
             </w:pPr>
             <w:r>
               <w:rPr>
                 <w:b/>
-                <w:sz w:val="17"/>
+                <w:sz w:val="18"/>
               </w:rPr>
               <w:t>E</w:t>
             </w:r>
             <w:r>
               <w:rPr>
                 <w:b/>
-                <w:sz w:val="17"/>
+                <w:sz w:val="18"/>
                 <w:vertAlign w:val="subscript"/>
               </w:rPr>
               <w:t>i</w:t>
@@ -7736,17 +7865,15 @@
             <w:r>
               <w:rPr>
                 <w:b/>
-                <w:sz w:val="17"/>
+                <w:sz w:val="18"/>
               </w:rPr>
               <w:t xml:space="preserve"> (MWh/yr)</w:t>
             </w:r>
           </w:p>
         </w:tc>
-      </w:tr>
-      <w:tr>
-        <w:tc>
-          <w:tcPr>
-            <w:tcW w:type="dxa" w:w="1584"/>
+        <w:tc>
+          <w:tcPr>
+            <w:tcW w:type="dxa" w:w="893"/>
             <w:tcBorders>
               <w:top w:val="single" w:sz="4" w:space="0" w:color="000000"/>
               <w:left w:val="single" w:sz="4" w:space="0" w:color="000000"/>
@@ -7759,23 +7886,41 @@
               <w:bottom w:w="30" w:type="dxa"/>
               <w:right w:w="80" w:type="dxa"/>
             </w:tcMar>
-          </w:tcPr>
-          <w:p>
-            <w:pPr>
+            <w:shd w:val="clear" w:fill="D9E2F3"/>
+          </w:tcPr>
+          <w:p>
+            <w:pPr>
+              <w:keepNext/>
               <w:spacing w:after="0"/>
               <w:jc w:val="center"/>
             </w:pPr>
             <w:r>
               <w:rPr>
-                <w:sz w:val="17"/>
-              </w:rPr>
-              <w:t>1</w:t>
-            </w:r>
-          </w:p>
-        </w:tc>
-        <w:tc>
-          <w:tcPr>
-            <w:tcW w:type="dxa" w:w="1584"/>
+                <w:b/>
+                <w:sz w:val="18"/>
+              </w:rPr>
+              <w:t>v</w:t>
+            </w:r>
+            <w:r>
+              <w:rPr>
+                <w:b/>
+                <w:sz w:val="18"/>
+                <w:vertAlign w:val="subscript"/>
+              </w:rPr>
+              <w:t>i</w:t>
+            </w:r>
+            <w:r>
+              <w:rPr>
+                <w:b/>
+                <w:sz w:val="18"/>
+              </w:rPr>
+              <w:t xml:space="preserve"> (m/s)</w:t>
+            </w:r>
+          </w:p>
+        </w:tc>
+        <w:tc>
+          <w:tcPr>
+            <w:tcW w:type="dxa" w:w="1037"/>
             <w:tcBorders>
               <w:top w:val="single" w:sz="4" w:space="0" w:color="000000"/>
               <w:left w:val="single" w:sz="4" w:space="0" w:color="000000"/>
@@ -7788,23 +7933,41 @@
               <w:bottom w:w="30" w:type="dxa"/>
               <w:right w:w="80" w:type="dxa"/>
             </w:tcMar>
-          </w:tcPr>
-          <w:p>
-            <w:pPr>
+            <w:shd w:val="clear" w:fill="D9E2F3"/>
+          </w:tcPr>
+          <w:p>
+            <w:pPr>
+              <w:keepNext/>
               <w:spacing w:after="0"/>
               <w:jc w:val="center"/>
             </w:pPr>
             <w:r>
               <w:rPr>
-                <w:sz w:val="17"/>
-              </w:rPr>
-              <w:t>156</w:t>
-            </w:r>
-          </w:p>
-        </w:tc>
-        <w:tc>
-          <w:tcPr>
-            <w:tcW w:type="dxa" w:w="1584"/>
+                <w:b/>
+                <w:sz w:val="18"/>
+              </w:rPr>
+              <w:t>h</w:t>
+            </w:r>
+            <w:r>
+              <w:rPr>
+                <w:b/>
+                <w:sz w:val="18"/>
+                <w:vertAlign w:val="subscript"/>
+              </w:rPr>
+              <w:t>i</w:t>
+            </w:r>
+            <w:r>
+              <w:rPr>
+                <w:b/>
+                <w:sz w:val="18"/>
+              </w:rPr>
+              <w:t xml:space="preserve"> (h/yr)</w:t>
+            </w:r>
+          </w:p>
+        </w:tc>
+        <w:tc>
+          <w:tcPr>
+            <w:tcW w:type="dxa" w:w="1037"/>
             <w:tcBorders>
               <w:top w:val="single" w:sz="4" w:space="0" w:color="000000"/>
               <w:left w:val="single" w:sz="4" w:space="0" w:color="000000"/>
@@ -7817,23 +7980,41 @@
               <w:bottom w:w="30" w:type="dxa"/>
               <w:right w:w="80" w:type="dxa"/>
             </w:tcMar>
-          </w:tcPr>
-          <w:p>
-            <w:pPr>
+            <w:shd w:val="clear" w:fill="D9E2F3"/>
+          </w:tcPr>
+          <w:p>
+            <w:pPr>
+              <w:keepNext/>
               <w:spacing w:after="0"/>
               <w:jc w:val="center"/>
             </w:pPr>
             <w:r>
               <w:rPr>
-                <w:sz w:val="17"/>
-              </w:rPr>
-              <w:t>0</w:t>
-            </w:r>
-          </w:p>
-        </w:tc>
-        <w:tc>
-          <w:tcPr>
-            <w:tcW w:type="dxa" w:w="1728"/>
+                <w:b/>
+                <w:sz w:val="18"/>
+              </w:rPr>
+              <w:t>P(v</w:t>
+            </w:r>
+            <w:r>
+              <w:rPr>
+                <w:b/>
+                <w:sz w:val="18"/>
+                <w:vertAlign w:val="subscript"/>
+              </w:rPr>
+              <w:t>i</w:t>
+            </w:r>
+            <w:r>
+              <w:rPr>
+                <w:b/>
+                <w:sz w:val="18"/>
+              </w:rPr>
+              <w:t>) (kW)</w:t>
+            </w:r>
+          </w:p>
+        </w:tc>
+        <w:tc>
+          <w:tcPr>
+            <w:tcW w:type="dxa" w:w="1152"/>
             <w:tcBorders>
               <w:top w:val="single" w:sz="4" w:space="0" w:color="000000"/>
               <w:left w:val="single" w:sz="4" w:space="0" w:color="000000"/>
@@ -7846,17 +8027,35 @@
               <w:bottom w:w="30" w:type="dxa"/>
               <w:right w:w="80" w:type="dxa"/>
             </w:tcMar>
-          </w:tcPr>
-          <w:p>
-            <w:pPr>
+            <w:shd w:val="clear" w:fill="D9E2F3"/>
+          </w:tcPr>
+          <w:p>
+            <w:pPr>
+              <w:keepNext/>
               <w:spacing w:after="0"/>
               <w:jc w:val="center"/>
             </w:pPr>
             <w:r>
               <w:rPr>
-                <w:sz w:val="17"/>
-              </w:rPr>
-              <w:t>0</w:t>
+                <w:b/>
+                <w:sz w:val="18"/>
+              </w:rPr>
+              <w:t>E</w:t>
+            </w:r>
+            <w:r>
+              <w:rPr>
+                <w:b/>
+                <w:sz w:val="18"/>
+                <w:vertAlign w:val="subscript"/>
+              </w:rPr>
+              <w:t>i</w:t>
+            </w:r>
+            <w:r>
+              <w:rPr>
+                <w:b/>
+                <w:sz w:val="18"/>
+              </w:rPr>
+              <w:t xml:space="preserve"> (MWh/yr)</w:t>
             </w:r>
           </w:p>
         </w:tc>
@@ -7864,7 +8063,7 @@
       <w:tr>
         <w:tc>
           <w:tcPr>
-            <w:tcW w:type="dxa" w:w="1584"/>
+            <w:tcW w:type="dxa" w:w="893"/>
             <w:tcBorders>
               <w:top w:val="single" w:sz="4" w:space="0" w:color="000000"/>
               <w:left w:val="single" w:sz="4" w:space="0" w:color="000000"/>
@@ -7880,20 +8079,21 @@
           </w:tcPr>
           <w:p>
             <w:pPr>
+              <w:keepNext/>
               <w:spacing w:after="0"/>
               <w:jc w:val="center"/>
             </w:pPr>
             <w:r>
               <w:rPr>
-                <w:sz w:val="17"/>
-              </w:rPr>
-              <w:t>2</w:t>
-            </w:r>
-          </w:p>
-        </w:tc>
-        <w:tc>
-          <w:tcPr>
-            <w:tcW w:type="dxa" w:w="1584"/>
+                <w:sz w:val="18"/>
+              </w:rPr>
+              <w:t>1</w:t>
+            </w:r>
+          </w:p>
+        </w:tc>
+        <w:tc>
+          <w:tcPr>
+            <w:tcW w:type="dxa" w:w="1037"/>
             <w:tcBorders>
               <w:top w:val="single" w:sz="4" w:space="0" w:color="000000"/>
               <w:left w:val="single" w:sz="4" w:space="0" w:color="000000"/>
@@ -7909,20 +8109,21 @@
           </w:tcPr>
           <w:p>
             <w:pPr>
+              <w:keepNext/>
               <w:spacing w:after="0"/>
               <w:jc w:val="center"/>
             </w:pPr>
             <w:r>
               <w:rPr>
-                <w:sz w:val="17"/>
-              </w:rPr>
-              <w:t>398</w:t>
-            </w:r>
-          </w:p>
-        </w:tc>
-        <w:tc>
-          <w:tcPr>
-            <w:tcW w:type="dxa" w:w="1584"/>
+                <w:sz w:val="18"/>
+              </w:rPr>
+              <w:t>156</w:t>
+            </w:r>
+          </w:p>
+        </w:tc>
+        <w:tc>
+          <w:tcPr>
+            <w:tcW w:type="dxa" w:w="1037"/>
             <w:tcBorders>
               <w:top w:val="single" w:sz="4" w:space="0" w:color="000000"/>
               <w:left w:val="single" w:sz="4" w:space="0" w:color="000000"/>
@@ -7938,12 +8139,13 @@
           </w:tcPr>
           <w:p>
             <w:pPr>
+              <w:keepNext/>
               <w:spacing w:after="0"/>
               <w:jc w:val="center"/>
             </w:pPr>
             <w:r>
               <w:rPr>
-                <w:sz w:val="17"/>
+                <w:sz w:val="18"/>
               </w:rPr>
               <w:t>0</w:t>
             </w:r>
@@ -7951,7 +8153,7 @@
         </w:tc>
         <w:tc>
           <w:tcPr>
-            <w:tcW w:type="dxa" w:w="1728"/>
+            <w:tcW w:type="dxa" w:w="1152"/>
             <w:tcBorders>
               <w:top w:val="single" w:sz="4" w:space="0" w:color="000000"/>
               <w:left w:val="single" w:sz="4" w:space="0" w:color="000000"/>
@@ -7967,22 +8169,21 @@
           </w:tcPr>
           <w:p>
             <w:pPr>
+              <w:keepNext/>
               <w:spacing w:after="0"/>
               <w:jc w:val="center"/>
             </w:pPr>
             <w:r>
               <w:rPr>
-                <w:sz w:val="17"/>
+                <w:sz w:val="18"/>
               </w:rPr>
               <w:t>0</w:t>
             </w:r>
           </w:p>
         </w:tc>
-      </w:tr>
-      <w:tr>
-        <w:tc>
-          <w:tcPr>
-            <w:tcW w:type="dxa" w:w="1584"/>
+        <w:tc>
+          <w:tcPr>
+            <w:tcW w:type="dxa" w:w="893"/>
             <w:tcBorders>
               <w:top w:val="single" w:sz="4" w:space="0" w:color="000000"/>
               <w:left w:val="single" w:sz="4" w:space="0" w:color="000000"/>
@@ -7998,20 +8199,21 @@
           </w:tcPr>
           <w:p>
             <w:pPr>
+              <w:keepNext/>
               <w:spacing w:after="0"/>
               <w:jc w:val="center"/>
             </w:pPr>
             <w:r>
               <w:rPr>
-                <w:sz w:val="17"/>
-              </w:rPr>
-              <w:t>3</w:t>
-            </w:r>
-          </w:p>
-        </w:tc>
-        <w:tc>
-          <w:tcPr>
-            <w:tcW w:type="dxa" w:w="1584"/>
+                <w:sz w:val="18"/>
+              </w:rPr>
+              <w:t>11</w:t>
+            </w:r>
+          </w:p>
+        </w:tc>
+        <w:tc>
+          <w:tcPr>
+            <w:tcW w:type="dxa" w:w="1037"/>
             <w:tcBorders>
               <w:top w:val="single" w:sz="4" w:space="0" w:color="000000"/>
               <w:left w:val="single" w:sz="4" w:space="0" w:color="000000"/>
@@ -8027,20 +8229,21 @@
           </w:tcPr>
           <w:p>
             <w:pPr>
+              <w:keepNext/>
               <w:spacing w:after="0"/>
               <w:jc w:val="center"/>
             </w:pPr>
             <w:r>
               <w:rPr>
-                <w:sz w:val="17"/>
-              </w:rPr>
-              <w:t>659</w:t>
-            </w:r>
-          </w:p>
-        </w:tc>
-        <w:tc>
-          <w:tcPr>
-            <w:tcW w:type="dxa" w:w="1584"/>
+                <w:sz w:val="18"/>
+              </w:rPr>
+              <w:t>426</w:t>
+            </w:r>
+          </w:p>
+        </w:tc>
+        <w:tc>
+          <w:tcPr>
+            <w:tcW w:type="dxa" w:w="1037"/>
             <w:tcBorders>
               <w:top w:val="single" w:sz="4" w:space="0" w:color="000000"/>
               <w:left w:val="single" w:sz="4" w:space="0" w:color="000000"/>
@@ -8056,20 +8259,21 @@
           </w:tcPr>
           <w:p>
             <w:pPr>
+              <w:keepNext/>
               <w:spacing w:after="0"/>
               <w:jc w:val="center"/>
             </w:pPr>
             <w:r>
               <w:rPr>
-                <w:sz w:val="17"/>
-              </w:rPr>
-              <w:t>28</w:t>
-            </w:r>
-          </w:p>
-        </w:tc>
-        <w:tc>
-          <w:tcPr>
-            <w:tcW w:type="dxa" w:w="1728"/>
+                <w:sz w:val="18"/>
+              </w:rPr>
+              <w:t>1,998</w:t>
+            </w:r>
+          </w:p>
+        </w:tc>
+        <w:tc>
+          <w:tcPr>
+            <w:tcW w:type="dxa" w:w="1152"/>
             <w:tcBorders>
               <w:top w:val="single" w:sz="4" w:space="0" w:color="000000"/>
               <w:left w:val="single" w:sz="4" w:space="0" w:color="000000"/>
@@ -8085,14 +8289,15 @@
           </w:tcPr>
           <w:p>
             <w:pPr>
+              <w:keepNext/>
               <w:spacing w:after="0"/>
               <w:jc w:val="center"/>
             </w:pPr>
             <w:r>
               <w:rPr>
-                <w:sz w:val="17"/>
-              </w:rPr>
-              <w:t>18</w:t>
+                <w:sz w:val="18"/>
+              </w:rPr>
+              <w:t>850</w:t>
             </w:r>
           </w:p>
         </w:tc>
@@ -8100,7 +8305,7 @@
       <w:tr>
         <w:tc>
           <w:tcPr>
-            <w:tcW w:type="dxa" w:w="1584"/>
+            <w:tcW w:type="dxa" w:w="893"/>
             <w:tcBorders>
               <w:top w:val="single" w:sz="4" w:space="0" w:color="000000"/>
               <w:left w:val="single" w:sz="4" w:space="0" w:color="000000"/>
@@ -8116,20 +8321,21 @@
           </w:tcPr>
           <w:p>
             <w:pPr>
+              <w:keepNext/>
               <w:spacing w:after="0"/>
               <w:jc w:val="center"/>
             </w:pPr>
             <w:r>
               <w:rPr>
-                <w:sz w:val="17"/>
-              </w:rPr>
-              <w:t>4</w:t>
-            </w:r>
-          </w:p>
-        </w:tc>
-        <w:tc>
-          <w:tcPr>
-            <w:tcW w:type="dxa" w:w="1584"/>
+                <w:sz w:val="18"/>
+              </w:rPr>
+              <w:t>2</w:t>
+            </w:r>
+          </w:p>
+        </w:tc>
+        <w:tc>
+          <w:tcPr>
+            <w:tcW w:type="dxa" w:w="1037"/>
             <w:tcBorders>
               <w:top w:val="single" w:sz="4" w:space="0" w:color="000000"/>
               <w:left w:val="single" w:sz="4" w:space="0" w:color="000000"/>
@@ -8145,20 +8351,21 @@
           </w:tcPr>
           <w:p>
             <w:pPr>
+              <w:keepNext/>
               <w:spacing w:after="0"/>
               <w:jc w:val="center"/>
             </w:pPr>
             <w:r>
               <w:rPr>
-                <w:sz w:val="17"/>
-              </w:rPr>
-              <w:t>889</w:t>
-            </w:r>
-          </w:p>
-        </w:tc>
-        <w:tc>
-          <w:tcPr>
-            <w:tcW w:type="dxa" w:w="1584"/>
+                <w:sz w:val="18"/>
+              </w:rPr>
+              <w:t>398</w:t>
+            </w:r>
+          </w:p>
+        </w:tc>
+        <w:tc>
+          <w:tcPr>
+            <w:tcW w:type="dxa" w:w="1037"/>
             <w:tcBorders>
               <w:top w:val="single" w:sz="4" w:space="0" w:color="000000"/>
               <w:left w:val="single" w:sz="4" w:space="0" w:color="000000"/>
@@ -8174,20 +8381,21 @@
           </w:tcPr>
           <w:p>
             <w:pPr>
+              <w:keepNext/>
               <w:spacing w:after="0"/>
               <w:jc w:val="center"/>
             </w:pPr>
             <w:r>
               <w:rPr>
-                <w:sz w:val="17"/>
-              </w:rPr>
-              <w:t>143</w:t>
-            </w:r>
-          </w:p>
-        </w:tc>
-        <w:tc>
-          <w:tcPr>
-            <w:tcW w:type="dxa" w:w="1728"/>
+                <w:sz w:val="18"/>
+              </w:rPr>
+              <w:t>0</w:t>
+            </w:r>
+          </w:p>
+        </w:tc>
+        <w:tc>
+          <w:tcPr>
+            <w:tcW w:type="dxa" w:w="1152"/>
             <w:tcBorders>
               <w:top w:val="single" w:sz="4" w:space="0" w:color="000000"/>
               <w:left w:val="single" w:sz="4" w:space="0" w:color="000000"/>
@@ -8203,22 +8411,21 @@
           </w:tcPr>
           <w:p>
             <w:pPr>
+              <w:keepNext/>
               <w:spacing w:after="0"/>
               <w:jc w:val="center"/>
             </w:pPr>
             <w:r>
               <w:rPr>
-                <w:sz w:val="17"/>
-              </w:rPr>
-              <w:t>127</w:t>
-            </w:r>
-          </w:p>
-        </w:tc>
-      </w:tr>
-      <w:tr>
-        <w:tc>
-          <w:tcPr>
-            <w:tcW w:type="dxa" w:w="1584"/>
+                <w:sz w:val="18"/>
+              </w:rPr>
+              <w:t>0</w:t>
+            </w:r>
+          </w:p>
+        </w:tc>
+        <w:tc>
+          <w:tcPr>
+            <w:tcW w:type="dxa" w:w="893"/>
             <w:tcBorders>
               <w:top w:val="single" w:sz="4" w:space="0" w:color="000000"/>
               <w:left w:val="single" w:sz="4" w:space="0" w:color="000000"/>
@@ -8234,20 +8441,21 @@
           </w:tcPr>
           <w:p>
             <w:pPr>
+              <w:keepNext/>
               <w:spacing w:after="0"/>
               <w:jc w:val="center"/>
             </w:pPr>
             <w:r>
               <w:rPr>
-                <w:sz w:val="17"/>
-              </w:rPr>
-              <w:t>5</w:t>
-            </w:r>
-          </w:p>
-        </w:tc>
-        <w:tc>
-          <w:tcPr>
-            <w:tcW w:type="dxa" w:w="1584"/>
+                <w:sz w:val="18"/>
+              </w:rPr>
+              <w:t>12</w:t>
+            </w:r>
+          </w:p>
+        </w:tc>
+        <w:tc>
+          <w:tcPr>
+            <w:tcW w:type="dxa" w:w="1037"/>
             <w:tcBorders>
               <w:top w:val="single" w:sz="4" w:space="0" w:color="000000"/>
               <w:left w:val="single" w:sz="4" w:space="0" w:color="000000"/>
@@ -8263,20 +8471,21 @@
           </w:tcPr>
           <w:p>
             <w:pPr>
+              <w:keepNext/>
               <w:spacing w:after="0"/>
               <w:jc w:val="center"/>
             </w:pPr>
             <w:r>
               <w:rPr>
-                <w:sz w:val="17"/>
-              </w:rPr>
-              <w:t>1,049</w:t>
-            </w:r>
-          </w:p>
-        </w:tc>
-        <w:tc>
-          <w:tcPr>
-            <w:tcW w:type="dxa" w:w="1584"/>
+                <w:sz w:val="18"/>
+              </w:rPr>
+              <w:t>278</w:t>
+            </w:r>
+          </w:p>
+        </w:tc>
+        <w:tc>
+          <w:tcPr>
+            <w:tcW w:type="dxa" w:w="1037"/>
             <w:tcBorders>
               <w:top w:val="single" w:sz="4" w:space="0" w:color="000000"/>
               <w:left w:val="single" w:sz="4" w:space="0" w:color="000000"/>
@@ -8292,20 +8501,21 @@
           </w:tcPr>
           <w:p>
             <w:pPr>
+              <w:keepNext/>
               <w:spacing w:after="0"/>
               <w:jc w:val="center"/>
             </w:pPr>
             <w:r>
               <w:rPr>
-                <w:sz w:val="17"/>
-              </w:rPr>
-              <w:t>315</w:t>
-            </w:r>
-          </w:p>
-        </w:tc>
-        <w:tc>
-          <w:tcPr>
-            <w:tcW w:type="dxa" w:w="1728"/>
+                <w:sz w:val="18"/>
+              </w:rPr>
+              <w:t>2,000</w:t>
+            </w:r>
+          </w:p>
+        </w:tc>
+        <w:tc>
+          <w:tcPr>
+            <w:tcW w:type="dxa" w:w="1152"/>
             <w:tcBorders>
               <w:top w:val="single" w:sz="4" w:space="0" w:color="000000"/>
               <w:left w:val="single" w:sz="4" w:space="0" w:color="000000"/>
@@ -8321,14 +8531,15 @@
           </w:tcPr>
           <w:p>
             <w:pPr>
+              <w:keepNext/>
               <w:spacing w:after="0"/>
               <w:jc w:val="center"/>
             </w:pPr>
             <w:r>
               <w:rPr>
-                <w:sz w:val="17"/>
-              </w:rPr>
-              <w:t>330</w:t>
+                <w:sz w:val="18"/>
+              </w:rPr>
+              <w:t>555</w:t>
             </w:r>
           </w:p>
         </w:tc>
@@ -8336,7 +8547,7 @@
       <w:tr>
         <w:tc>
           <w:tcPr>
-            <w:tcW w:type="dxa" w:w="1584"/>
+            <w:tcW w:type="dxa" w:w="893"/>
             <w:tcBorders>
               <w:top w:val="single" w:sz="4" w:space="0" w:color="000000"/>
               <w:left w:val="single" w:sz="4" w:space="0" w:color="000000"/>
@@ -8352,20 +8563,21 @@
           </w:tcPr>
           <w:p>
             <w:pPr>
+              <w:keepNext/>
               <w:spacing w:after="0"/>
               <w:jc w:val="center"/>
             </w:pPr>
             <w:r>
               <w:rPr>
-                <w:sz w:val="17"/>
-              </w:rPr>
-              <w:t>6</w:t>
-            </w:r>
-          </w:p>
-        </w:tc>
-        <w:tc>
-          <w:tcPr>
-            <w:tcW w:type="dxa" w:w="1584"/>
+                <w:sz w:val="18"/>
+              </w:rPr>
+              <w:t>3</w:t>
+            </w:r>
+          </w:p>
+        </w:tc>
+        <w:tc>
+          <w:tcPr>
+            <w:tcW w:type="dxa" w:w="1037"/>
             <w:tcBorders>
               <w:top w:val="single" w:sz="4" w:space="0" w:color="000000"/>
               <w:left w:val="single" w:sz="4" w:space="0" w:color="000000"/>
@@ -8381,20 +8593,21 @@
           </w:tcPr>
           <w:p>
             <w:pPr>
+              <w:keepNext/>
               <w:spacing w:after="0"/>
               <w:jc w:val="center"/>
             </w:pPr>
             <w:r>
               <w:rPr>
-                <w:sz w:val="17"/>
-              </w:rPr>
-              <w:t>1,114</w:t>
-            </w:r>
-          </w:p>
-        </w:tc>
-        <w:tc>
-          <w:tcPr>
-            <w:tcW w:type="dxa" w:w="1584"/>
+                <w:sz w:val="18"/>
+              </w:rPr>
+              <w:t>659</w:t>
+            </w:r>
+          </w:p>
+        </w:tc>
+        <w:tc>
+          <w:tcPr>
+            <w:tcW w:type="dxa" w:w="1037"/>
             <w:tcBorders>
               <w:top w:val="single" w:sz="4" w:space="0" w:color="000000"/>
               <w:left w:val="single" w:sz="4" w:space="0" w:color="000000"/>
@@ -8410,20 +8623,21 @@
           </w:tcPr>
           <w:p>
             <w:pPr>
+              <w:keepNext/>
               <w:spacing w:after="0"/>
               <w:jc w:val="center"/>
             </w:pPr>
             <w:r>
               <w:rPr>
-                <w:sz w:val="17"/>
-              </w:rPr>
-              <w:t>552</w:t>
-            </w:r>
-          </w:p>
-        </w:tc>
-        <w:tc>
-          <w:tcPr>
-            <w:tcW w:type="dxa" w:w="1728"/>
+                <w:sz w:val="18"/>
+              </w:rPr>
+              <w:t>28</w:t>
+            </w:r>
+          </w:p>
+        </w:tc>
+        <w:tc>
+          <w:tcPr>
+            <w:tcW w:type="dxa" w:w="1152"/>
             <w:tcBorders>
               <w:top w:val="single" w:sz="4" w:space="0" w:color="000000"/>
               <w:left w:val="single" w:sz="4" w:space="0" w:color="000000"/>
@@ -8439,22 +8653,21 @@
           </w:tcPr>
           <w:p>
             <w:pPr>
+              <w:keepNext/>
               <w:spacing w:after="0"/>
               <w:jc w:val="center"/>
             </w:pPr>
             <w:r>
               <w:rPr>
-                <w:sz w:val="17"/>
-              </w:rPr>
-              <w:t>614</w:t>
-            </w:r>
-          </w:p>
-        </w:tc>
-      </w:tr>
-      <w:tr>
-        <w:tc>
-          <w:tcPr>
-            <w:tcW w:type="dxa" w:w="1584"/>
+                <w:sz w:val="18"/>
+              </w:rPr>
+              <w:t>18</w:t>
+            </w:r>
+          </w:p>
+        </w:tc>
+        <w:tc>
+          <w:tcPr>
+            <w:tcW w:type="dxa" w:w="893"/>
             <w:tcBorders>
               <w:top w:val="single" w:sz="4" w:space="0" w:color="000000"/>
               <w:left w:val="single" w:sz="4" w:space="0" w:color="000000"/>
@@ -8470,20 +8683,21 @@
           </w:tcPr>
           <w:p>
             <w:pPr>
+              <w:keepNext/>
               <w:spacing w:after="0"/>
               <w:jc w:val="center"/>
             </w:pPr>
             <w:r>
               <w:rPr>
-                <w:sz w:val="17"/>
-              </w:rPr>
-              <w:t>7</w:t>
-            </w:r>
-          </w:p>
-        </w:tc>
-        <w:tc>
-          <w:tcPr>
-            <w:tcW w:type="dxa" w:w="1584"/>
+                <w:sz w:val="18"/>
+              </w:rPr>
+              <w:t>13</w:t>
+            </w:r>
+          </w:p>
+        </w:tc>
+        <w:tc>
+          <w:tcPr>
+            <w:tcW w:type="dxa" w:w="1037"/>
             <w:tcBorders>
               <w:top w:val="single" w:sz="4" w:space="0" w:color="000000"/>
               <w:left w:val="single" w:sz="4" w:space="0" w:color="000000"/>
@@ -8499,20 +8713,21 @@
           </w:tcPr>
           <w:p>
             <w:pPr>
+              <w:keepNext/>
               <w:spacing w:after="0"/>
               <w:jc w:val="center"/>
             </w:pPr>
             <w:r>
               <w:rPr>
-                <w:sz w:val="17"/>
-              </w:rPr>
-              <w:t>1,080</w:t>
-            </w:r>
-          </w:p>
-        </w:tc>
-        <w:tc>
-          <w:tcPr>
-            <w:tcW w:type="dxa" w:w="1584"/>
+                <w:sz w:val="18"/>
+              </w:rPr>
+              <w:t>168</w:t>
+            </w:r>
+          </w:p>
+        </w:tc>
+        <w:tc>
+          <w:tcPr>
+            <w:tcW w:type="dxa" w:w="1037"/>
             <w:tcBorders>
               <w:top w:val="single" w:sz="4" w:space="0" w:color="000000"/>
               <w:left w:val="single" w:sz="4" w:space="0" w:color="000000"/>
@@ -8528,20 +8743,21 @@
           </w:tcPr>
           <w:p>
             <w:pPr>
+              <w:keepNext/>
               <w:spacing w:after="0"/>
               <w:jc w:val="center"/>
             </w:pPr>
             <w:r>
               <w:rPr>
-                <w:sz w:val="17"/>
-              </w:rPr>
-              <w:t>904</w:t>
-            </w:r>
-          </w:p>
-        </w:tc>
-        <w:tc>
-          <w:tcPr>
-            <w:tcW w:type="dxa" w:w="1728"/>
+                <w:sz w:val="18"/>
+              </w:rPr>
+              <w:t>2,000</w:t>
+            </w:r>
+          </w:p>
+        </w:tc>
+        <w:tc>
+          <w:tcPr>
+            <w:tcW w:type="dxa" w:w="1152"/>
             <w:tcBorders>
               <w:top w:val="single" w:sz="4" w:space="0" w:color="000000"/>
               <w:left w:val="single" w:sz="4" w:space="0" w:color="000000"/>
@@ -8557,14 +8773,15 @@
           </w:tcPr>
           <w:p>
             <w:pPr>
+              <w:keepNext/>
               <w:spacing w:after="0"/>
               <w:jc w:val="center"/>
             </w:pPr>
             <w:r>
               <w:rPr>
-                <w:sz w:val="17"/>
-              </w:rPr>
-              <w:t>976</w:t>
+                <w:sz w:val="18"/>
+              </w:rPr>
+              <w:t>335</w:t>
             </w:r>
           </w:p>
         </w:tc>
@@ -8572,7 +8789,7 @@
       <w:tr>
         <w:tc>
           <w:tcPr>
-            <w:tcW w:type="dxa" w:w="1584"/>
+            <w:tcW w:type="dxa" w:w="893"/>
             <w:tcBorders>
               <w:top w:val="single" w:sz="4" w:space="0" w:color="000000"/>
               <w:left w:val="single" w:sz="4" w:space="0" w:color="000000"/>
@@ -8588,20 +8805,21 @@
           </w:tcPr>
           <w:p>
             <w:pPr>
+              <w:keepNext/>
               <w:spacing w:after="0"/>
               <w:jc w:val="center"/>
             </w:pPr>
             <w:r>
               <w:rPr>
-                <w:sz w:val="17"/>
-              </w:rPr>
-              <w:t>8</w:t>
-            </w:r>
-          </w:p>
-        </w:tc>
-        <w:tc>
-          <w:tcPr>
-            <w:tcW w:type="dxa" w:w="1584"/>
+                <w:sz w:val="18"/>
+              </w:rPr>
+              <w:t>4</w:t>
+            </w:r>
+          </w:p>
+        </w:tc>
+        <w:tc>
+          <w:tcPr>
+            <w:tcW w:type="dxa" w:w="1037"/>
             <w:tcBorders>
               <w:top w:val="single" w:sz="4" w:space="0" w:color="000000"/>
               <w:left w:val="single" w:sz="4" w:space="0" w:color="000000"/>
@@ -8617,20 +8835,21 @@
           </w:tcPr>
           <w:p>
             <w:pPr>
+              <w:keepNext/>
               <w:spacing w:after="0"/>
               <w:jc w:val="center"/>
             </w:pPr>
             <w:r>
               <w:rPr>
-                <w:sz w:val="17"/>
-              </w:rPr>
-              <w:t>963</w:t>
-            </w:r>
-          </w:p>
-        </w:tc>
-        <w:tc>
-          <w:tcPr>
-            <w:tcW w:type="dxa" w:w="1584"/>
+                <w:sz w:val="18"/>
+              </w:rPr>
+              <w:t>889</w:t>
+            </w:r>
+          </w:p>
+        </w:tc>
+        <w:tc>
+          <w:tcPr>
+            <w:tcW w:type="dxa" w:w="1037"/>
             <w:tcBorders>
               <w:top w:val="single" w:sz="4" w:space="0" w:color="000000"/>
               <w:left w:val="single" w:sz="4" w:space="0" w:color="000000"/>
@@ -8646,20 +8865,21 @@
           </w:tcPr>
           <w:p>
             <w:pPr>
+              <w:keepNext/>
               <w:spacing w:after="0"/>
               <w:jc w:val="center"/>
             </w:pPr>
             <w:r>
               <w:rPr>
-                <w:sz w:val="17"/>
-              </w:rPr>
-              <w:t>1,349</w:t>
-            </w:r>
-          </w:p>
-        </w:tc>
-        <w:tc>
-          <w:tcPr>
-            <w:tcW w:type="dxa" w:w="1728"/>
+                <w:sz w:val="18"/>
+              </w:rPr>
+              <w:t>143</w:t>
+            </w:r>
+          </w:p>
+        </w:tc>
+        <w:tc>
+          <w:tcPr>
+            <w:tcW w:type="dxa" w:w="1152"/>
             <w:tcBorders>
               <w:top w:val="single" w:sz="4" w:space="0" w:color="000000"/>
               <w:left w:val="single" w:sz="4" w:space="0" w:color="000000"/>
@@ -8675,22 +8895,21 @@
           </w:tcPr>
           <w:p>
             <w:pPr>
+              <w:keepNext/>
               <w:spacing w:after="0"/>
               <w:jc w:val="center"/>
             </w:pPr>
             <w:r>
               <w:rPr>
-                <w:sz w:val="17"/>
-              </w:rPr>
-              <w:t>1,299</w:t>
-            </w:r>
-          </w:p>
-        </w:tc>
-      </w:tr>
-      <w:tr>
-        <w:tc>
-          <w:tcPr>
-            <w:tcW w:type="dxa" w:w="1584"/>
+                <w:sz w:val="18"/>
+              </w:rPr>
+              <w:t>127</w:t>
+            </w:r>
+          </w:p>
+        </w:tc>
+        <w:tc>
+          <w:tcPr>
+            <w:tcW w:type="dxa" w:w="893"/>
             <w:tcBorders>
               <w:top w:val="single" w:sz="4" w:space="0" w:color="000000"/>
               <w:left w:val="single" w:sz="4" w:space="0" w:color="000000"/>
@@ -8706,20 +8925,21 @@
           </w:tcPr>
           <w:p>
             <w:pPr>
+              <w:keepNext/>
               <w:spacing w:after="0"/>
               <w:jc w:val="center"/>
             </w:pPr>
             <w:r>
               <w:rPr>
-                <w:sz w:val="17"/>
-              </w:rPr>
-              <w:t>9</w:t>
-            </w:r>
-          </w:p>
-        </w:tc>
-        <w:tc>
-          <w:tcPr>
-            <w:tcW w:type="dxa" w:w="1584"/>
+                <w:sz w:val="18"/>
+              </w:rPr>
+              <w:t>14</w:t>
+            </w:r>
+          </w:p>
+        </w:tc>
+        <w:tc>
+          <w:tcPr>
+            <w:tcW w:type="dxa" w:w="1037"/>
             <w:tcBorders>
               <w:top w:val="single" w:sz="4" w:space="0" w:color="000000"/>
               <w:left w:val="single" w:sz="4" w:space="0" w:color="000000"/>
@@ -8735,20 +8955,21 @@
           </w:tcPr>
           <w:p>
             <w:pPr>
+              <w:keepNext/>
               <w:spacing w:after="0"/>
               <w:jc w:val="center"/>
             </w:pPr>
             <w:r>
               <w:rPr>
-                <w:sz w:val="17"/>
-              </w:rPr>
-              <w:t>793</w:t>
-            </w:r>
-          </w:p>
-        </w:tc>
-        <w:tc>
-          <w:tcPr>
-            <w:tcW w:type="dxa" w:w="1584"/>
+                <w:sz w:val="18"/>
+              </w:rPr>
+              <w:t>93</w:t>
+            </w:r>
+          </w:p>
+        </w:tc>
+        <w:tc>
+          <w:tcPr>
+            <w:tcW w:type="dxa" w:w="1037"/>
             <w:tcBorders>
               <w:top w:val="single" w:sz="4" w:space="0" w:color="000000"/>
               <w:left w:val="single" w:sz="4" w:space="0" w:color="000000"/>
@@ -8764,20 +8985,21 @@
           </w:tcPr>
           <w:p>
             <w:pPr>
+              <w:keepNext/>
               <w:spacing w:after="0"/>
               <w:jc w:val="center"/>
             </w:pPr>
             <w:r>
               <w:rPr>
-                <w:sz w:val="17"/>
-              </w:rPr>
-              <w:t>1,774</w:t>
-            </w:r>
-          </w:p>
-        </w:tc>
-        <w:tc>
-          <w:tcPr>
-            <w:tcW w:type="dxa" w:w="1728"/>
+                <w:sz w:val="18"/>
+              </w:rPr>
+              <w:t>2,000</w:t>
+            </w:r>
+          </w:p>
+        </w:tc>
+        <w:tc>
+          <w:tcPr>
+            <w:tcW w:type="dxa" w:w="1152"/>
             <w:tcBorders>
               <w:top w:val="single" w:sz="4" w:space="0" w:color="000000"/>
               <w:left w:val="single" w:sz="4" w:space="0" w:color="000000"/>
@@ -8793,14 +9015,15 @@
           </w:tcPr>
           <w:p>
             <w:pPr>
+              <w:keepNext/>
               <w:spacing w:after="0"/>
               <w:jc w:val="center"/>
             </w:pPr>
             <w:r>
               <w:rPr>
-                <w:sz w:val="17"/>
-              </w:rPr>
-              <w:t>1,407</w:t>
+                <w:sz w:val="18"/>
+              </w:rPr>
+              <w:t>187</w:t>
             </w:r>
           </w:p>
         </w:tc>
@@ -8808,7 +9031,7 @@
       <w:tr>
         <w:tc>
           <w:tcPr>
-            <w:tcW w:type="dxa" w:w="1584"/>
+            <w:tcW w:type="dxa" w:w="893"/>
             <w:tcBorders>
               <w:top w:val="single" w:sz="4" w:space="0" w:color="000000"/>
               <w:left w:val="single" w:sz="4" w:space="0" w:color="000000"/>
@@ -8824,20 +9047,21 @@
           </w:tcPr>
           <w:p>
             <w:pPr>
+              <w:keepNext/>
               <w:spacing w:after="0"/>
               <w:jc w:val="center"/>
             </w:pPr>
             <w:r>
               <w:rPr>
-                <w:sz w:val="17"/>
-              </w:rPr>
-              <w:t>10</w:t>
-            </w:r>
-          </w:p>
-        </w:tc>
-        <w:tc>
-          <w:tcPr>
-            <w:tcW w:type="dxa" w:w="1584"/>
+                <w:sz w:val="18"/>
+              </w:rPr>
+              <w:t>5</w:t>
+            </w:r>
+          </w:p>
+        </w:tc>
+        <w:tc>
+          <w:tcPr>
+            <w:tcW w:type="dxa" w:w="1037"/>
             <w:tcBorders>
               <w:top w:val="single" w:sz="4" w:space="0" w:color="000000"/>
               <w:left w:val="single" w:sz="4" w:space="0" w:color="000000"/>
@@ -8853,20 +9077,21 @@
           </w:tcPr>
           <w:p>
             <w:pPr>
+              <w:keepNext/>
               <w:spacing w:after="0"/>
               <w:jc w:val="center"/>
             </w:pPr>
             <w:r>
               <w:rPr>
-                <w:sz w:val="17"/>
-              </w:rPr>
-              <w:t>604</w:t>
-            </w:r>
-          </w:p>
-        </w:tc>
-        <w:tc>
-          <w:tcPr>
-            <w:tcW w:type="dxa" w:w="1584"/>
+                <w:sz w:val="18"/>
+              </w:rPr>
+              <w:t>1,049</w:t>
+            </w:r>
+          </w:p>
+        </w:tc>
+        <w:tc>
+          <w:tcPr>
+            <w:tcW w:type="dxa" w:w="1037"/>
             <w:tcBorders>
               <w:top w:val="single" w:sz="4" w:space="0" w:color="000000"/>
               <w:left w:val="single" w:sz="4" w:space="0" w:color="000000"/>
@@ -8882,20 +9107,21 @@
           </w:tcPr>
           <w:p>
             <w:pPr>
+              <w:keepNext/>
               <w:spacing w:after="0"/>
               <w:jc w:val="center"/>
             </w:pPr>
             <w:r>
               <w:rPr>
-                <w:sz w:val="17"/>
-              </w:rPr>
-              <w:t>1,970</w:t>
-            </w:r>
-          </w:p>
-        </w:tc>
-        <w:tc>
-          <w:tcPr>
-            <w:tcW w:type="dxa" w:w="1728"/>
+                <w:sz w:val="18"/>
+              </w:rPr>
+              <w:t>315</w:t>
+            </w:r>
+          </w:p>
+        </w:tc>
+        <w:tc>
+          <w:tcPr>
+            <w:tcW w:type="dxa" w:w="1152"/>
             <w:tcBorders>
               <w:top w:val="single" w:sz="4" w:space="0" w:color="000000"/>
               <w:left w:val="single" w:sz="4" w:space="0" w:color="000000"/>
@@ -8911,22 +9137,21 @@
           </w:tcPr>
           <w:p>
             <w:pPr>
+              <w:keepNext/>
               <w:spacing w:after="0"/>
               <w:jc w:val="center"/>
             </w:pPr>
             <w:r>
               <w:rPr>
-                <w:sz w:val="17"/>
-              </w:rPr>
-              <w:t>1,190</w:t>
-            </w:r>
-          </w:p>
-        </w:tc>
-      </w:tr>
-      <w:tr>
-        <w:tc>
-          <w:tcPr>
-            <w:tcW w:type="dxa" w:w="1584"/>
+                <w:sz w:val="18"/>
+              </w:rPr>
+              <w:t>330</w:t>
+            </w:r>
+          </w:p>
+        </w:tc>
+        <w:tc>
+          <w:tcPr>
+            <w:tcW w:type="dxa" w:w="893"/>
             <w:tcBorders>
               <w:top w:val="single" w:sz="4" w:space="0" w:color="000000"/>
               <w:left w:val="single" w:sz="4" w:space="0" w:color="000000"/>
@@ -8942,20 +9167,21 @@
           </w:tcPr>
           <w:p>
             <w:pPr>
+              <w:keepNext/>
               <w:spacing w:after="0"/>
               <w:jc w:val="center"/>
             </w:pPr>
             <w:r>
               <w:rPr>
-                <w:sz w:val="17"/>
-              </w:rPr>
-              <w:t>11</w:t>
-            </w:r>
-          </w:p>
-        </w:tc>
-        <w:tc>
-          <w:tcPr>
-            <w:tcW w:type="dxa" w:w="1584"/>
+                <w:sz w:val="18"/>
+              </w:rPr>
+              <w:t>15</w:t>
+            </w:r>
+          </w:p>
+        </w:tc>
+        <w:tc>
+          <w:tcPr>
+            <w:tcW w:type="dxa" w:w="1037"/>
             <w:tcBorders>
               <w:top w:val="single" w:sz="4" w:space="0" w:color="000000"/>
               <w:left w:val="single" w:sz="4" w:space="0" w:color="000000"/>
@@ -8971,20 +9197,21 @@
           </w:tcPr>
           <w:p>
             <w:pPr>
+              <w:keepNext/>
               <w:spacing w:after="0"/>
               <w:jc w:val="center"/>
             </w:pPr>
             <w:r>
               <w:rPr>
-                <w:sz w:val="17"/>
-              </w:rPr>
-              <w:t>426</w:t>
-            </w:r>
-          </w:p>
-        </w:tc>
-        <w:tc>
-          <w:tcPr>
-            <w:tcW w:type="dxa" w:w="1584"/>
+                <w:sz w:val="18"/>
+              </w:rPr>
+              <w:t>48</w:t>
+            </w:r>
+          </w:p>
+        </w:tc>
+        <w:tc>
+          <w:tcPr>
+            <w:tcW w:type="dxa" w:w="1037"/>
             <w:tcBorders>
               <w:top w:val="single" w:sz="4" w:space="0" w:color="000000"/>
               <w:left w:val="single" w:sz="4" w:space="0" w:color="000000"/>
@@ -9000,20 +9227,21 @@
           </w:tcPr>
           <w:p>
             <w:pPr>
+              <w:keepNext/>
               <w:spacing w:after="0"/>
               <w:jc w:val="center"/>
             </w:pPr>
             <w:r>
               <w:rPr>
-                <w:sz w:val="17"/>
-              </w:rPr>
-              <w:t>1,998</w:t>
-            </w:r>
-          </w:p>
-        </w:tc>
-        <w:tc>
-          <w:tcPr>
-            <w:tcW w:type="dxa" w:w="1728"/>
+                <w:sz w:val="18"/>
+              </w:rPr>
+              <w:t>2,000</w:t>
+            </w:r>
+          </w:p>
+        </w:tc>
+        <w:tc>
+          <w:tcPr>
+            <w:tcW w:type="dxa" w:w="1152"/>
             <w:tcBorders>
               <w:top w:val="single" w:sz="4" w:space="0" w:color="000000"/>
               <w:left w:val="single" w:sz="4" w:space="0" w:color="000000"/>
@@ -9029,14 +9257,15 @@
           </w:tcPr>
           <w:p>
             <w:pPr>
+              <w:keepNext/>
               <w:spacing w:after="0"/>
               <w:jc w:val="center"/>
             </w:pPr>
             <w:r>
               <w:rPr>
-                <w:sz w:val="17"/>
-              </w:rPr>
-              <w:t>850</w:t>
+                <w:sz w:val="18"/>
+              </w:rPr>
+              <w:t>96</w:t>
             </w:r>
           </w:p>
         </w:tc>
@@ -9044,7 +9273,7 @@
       <w:tr>
         <w:tc>
           <w:tcPr>
-            <w:tcW w:type="dxa" w:w="1584"/>
+            <w:tcW w:type="dxa" w:w="893"/>
             <w:tcBorders>
               <w:top w:val="single" w:sz="4" w:space="0" w:color="000000"/>
               <w:left w:val="single" w:sz="4" w:space="0" w:color="000000"/>
@@ -9060,20 +9289,21 @@
           </w:tcPr>
           <w:p>
             <w:pPr>
+              <w:keepNext/>
               <w:spacing w:after="0"/>
               <w:jc w:val="center"/>
             </w:pPr>
             <w:r>
               <w:rPr>
-                <w:sz w:val="17"/>
-              </w:rPr>
-              <w:t>12</w:t>
-            </w:r>
-          </w:p>
-        </w:tc>
-        <w:tc>
-          <w:tcPr>
-            <w:tcW w:type="dxa" w:w="1584"/>
+                <w:sz w:val="18"/>
+              </w:rPr>
+              <w:t>6</w:t>
+            </w:r>
+          </w:p>
+        </w:tc>
+        <w:tc>
+          <w:tcPr>
+            <w:tcW w:type="dxa" w:w="1037"/>
             <w:tcBorders>
               <w:top w:val="single" w:sz="4" w:space="0" w:color="000000"/>
               <w:left w:val="single" w:sz="4" w:space="0" w:color="000000"/>
@@ -9089,20 +9319,21 @@
           </w:tcPr>
           <w:p>
             <w:pPr>
+              <w:keepNext/>
               <w:spacing w:after="0"/>
               <w:jc w:val="center"/>
             </w:pPr>
             <w:r>
               <w:rPr>
-                <w:sz w:val="17"/>
-              </w:rPr>
-              <w:t>278</w:t>
-            </w:r>
-          </w:p>
-        </w:tc>
-        <w:tc>
-          <w:tcPr>
-            <w:tcW w:type="dxa" w:w="1584"/>
+                <w:sz w:val="18"/>
+              </w:rPr>
+              <w:t>1,114</w:t>
+            </w:r>
+          </w:p>
+        </w:tc>
+        <w:tc>
+          <w:tcPr>
+            <w:tcW w:type="dxa" w:w="1037"/>
             <w:tcBorders>
               <w:top w:val="single" w:sz="4" w:space="0" w:color="000000"/>
               <w:left w:val="single" w:sz="4" w:space="0" w:color="000000"/>
@@ -9118,20 +9349,21 @@
           </w:tcPr>
           <w:p>
             <w:pPr>
+              <w:keepNext/>
               <w:spacing w:after="0"/>
               <w:jc w:val="center"/>
             </w:pPr>
             <w:r>
               <w:rPr>
-                <w:sz w:val="17"/>
-              </w:rPr>
-              <w:t>2,000</w:t>
-            </w:r>
-          </w:p>
-        </w:tc>
-        <w:tc>
-          <w:tcPr>
-            <w:tcW w:type="dxa" w:w="1728"/>
+                <w:sz w:val="18"/>
+              </w:rPr>
+              <w:t>552</w:t>
+            </w:r>
+          </w:p>
+        </w:tc>
+        <w:tc>
+          <w:tcPr>
+            <w:tcW w:type="dxa" w:w="1152"/>
             <w:tcBorders>
               <w:top w:val="single" w:sz="4" w:space="0" w:color="000000"/>
               <w:left w:val="single" w:sz="4" w:space="0" w:color="000000"/>
@@ -9147,22 +9379,21 @@
           </w:tcPr>
           <w:p>
             <w:pPr>
+              <w:keepNext/>
               <w:spacing w:after="0"/>
               <w:jc w:val="center"/>
             </w:pPr>
             <w:r>
               <w:rPr>
-                <w:sz w:val="17"/>
-              </w:rPr>
-              <w:t>555</w:t>
-            </w:r>
-          </w:p>
-        </w:tc>
-      </w:tr>
-      <w:tr>
-        <w:tc>
-          <w:tcPr>
-            <w:tcW w:type="dxa" w:w="1584"/>
+                <w:sz w:val="18"/>
+              </w:rPr>
+              <w:t>614</w:t>
+            </w:r>
+          </w:p>
+        </w:tc>
+        <w:tc>
+          <w:tcPr>
+            <w:tcW w:type="dxa" w:w="893"/>
             <w:tcBorders>
               <w:top w:val="single" w:sz="4" w:space="0" w:color="000000"/>
               <w:left w:val="single" w:sz="4" w:space="0" w:color="000000"/>
@@ -9178,20 +9409,21 @@
           </w:tcPr>
           <w:p>
             <w:pPr>
+              <w:keepNext/>
               <w:spacing w:after="0"/>
               <w:jc w:val="center"/>
             </w:pPr>
             <w:r>
               <w:rPr>
-                <w:sz w:val="17"/>
-              </w:rPr>
-              <w:t>13</w:t>
-            </w:r>
-          </w:p>
-        </w:tc>
-        <w:tc>
-          <w:tcPr>
-            <w:tcW w:type="dxa" w:w="1584"/>
+                <w:sz w:val="18"/>
+              </w:rPr>
+              <w:t>16</w:t>
+            </w:r>
+          </w:p>
+        </w:tc>
+        <w:tc>
+          <w:tcPr>
+            <w:tcW w:type="dxa" w:w="1037"/>
             <w:tcBorders>
               <w:top w:val="single" w:sz="4" w:space="0" w:color="000000"/>
               <w:left w:val="single" w:sz="4" w:space="0" w:color="000000"/>
@@ -9207,20 +9439,21 @@
           </w:tcPr>
           <w:p>
             <w:pPr>
+              <w:keepNext/>
               <w:spacing w:after="0"/>
               <w:jc w:val="center"/>
             </w:pPr>
             <w:r>
               <w:rPr>
-                <w:sz w:val="17"/>
-              </w:rPr>
-              <w:t>168</w:t>
-            </w:r>
-          </w:p>
-        </w:tc>
-        <w:tc>
-          <w:tcPr>
-            <w:tcW w:type="dxa" w:w="1584"/>
+                <w:sz w:val="18"/>
+              </w:rPr>
+              <w:t>23</w:t>
+            </w:r>
+          </w:p>
+        </w:tc>
+        <w:tc>
+          <w:tcPr>
+            <w:tcW w:type="dxa" w:w="1037"/>
             <w:tcBorders>
               <w:top w:val="single" w:sz="4" w:space="0" w:color="000000"/>
               <w:left w:val="single" w:sz="4" w:space="0" w:color="000000"/>
@@ -9236,12 +9469,13 @@
           </w:tcPr>
           <w:p>
             <w:pPr>
+              <w:keepNext/>
               <w:spacing w:after="0"/>
               <w:jc w:val="center"/>
             </w:pPr>
             <w:r>
               <w:rPr>
-                <w:sz w:val="17"/>
+                <w:sz w:val="18"/>
               </w:rPr>
               <w:t>2,000</w:t>
             </w:r>
@@ -9249,7 +9483,7 @@
         </w:tc>
         <w:tc>
           <w:tcPr>
-            <w:tcW w:type="dxa" w:w="1728"/>
+            <w:tcW w:type="dxa" w:w="1152"/>
             <w:tcBorders>
               <w:top w:val="single" w:sz="4" w:space="0" w:color="000000"/>
               <w:left w:val="single" w:sz="4" w:space="0" w:color="000000"/>
@@ -9265,14 +9499,15 @@
           </w:tcPr>
           <w:p>
             <w:pPr>
+              <w:keepNext/>
               <w:spacing w:after="0"/>
               <w:jc w:val="center"/>
             </w:pPr>
             <w:r>
               <w:rPr>
-                <w:sz w:val="17"/>
-              </w:rPr>
-              <w:t>335</w:t>
+                <w:sz w:val="18"/>
+              </w:rPr>
+              <w:t>46</w:t>
             </w:r>
           </w:p>
         </w:tc>
@@ -9280,7 +9515,7 @@
       <w:tr>
         <w:tc>
           <w:tcPr>
-            <w:tcW w:type="dxa" w:w="1584"/>
+            <w:tcW w:type="dxa" w:w="893"/>
             <w:tcBorders>
               <w:top w:val="single" w:sz="4" w:space="0" w:color="000000"/>
               <w:left w:val="single" w:sz="4" w:space="0" w:color="000000"/>
@@ -9296,20 +9531,21 @@
           </w:tcPr>
           <w:p>
             <w:pPr>
+              <w:keepNext/>
               <w:spacing w:after="0"/>
               <w:jc w:val="center"/>
             </w:pPr>
             <w:r>
               <w:rPr>
-                <w:sz w:val="17"/>
-              </w:rPr>
-              <w:t>14</w:t>
-            </w:r>
-          </w:p>
-        </w:tc>
-        <w:tc>
-          <w:tcPr>
-            <w:tcW w:type="dxa" w:w="1584"/>
+                <w:sz w:val="18"/>
+              </w:rPr>
+              <w:t>7</w:t>
+            </w:r>
+          </w:p>
+        </w:tc>
+        <w:tc>
+          <w:tcPr>
+            <w:tcW w:type="dxa" w:w="1037"/>
             <w:tcBorders>
               <w:top w:val="single" w:sz="4" w:space="0" w:color="000000"/>
               <w:left w:val="single" w:sz="4" w:space="0" w:color="000000"/>
@@ -9325,20 +9561,21 @@
           </w:tcPr>
           <w:p>
             <w:pPr>
+              <w:keepNext/>
               <w:spacing w:after="0"/>
               <w:jc w:val="center"/>
             </w:pPr>
             <w:r>
               <w:rPr>
-                <w:sz w:val="17"/>
-              </w:rPr>
-              <w:t>93</w:t>
-            </w:r>
-          </w:p>
-        </w:tc>
-        <w:tc>
-          <w:tcPr>
-            <w:tcW w:type="dxa" w:w="1584"/>
+                <w:sz w:val="18"/>
+              </w:rPr>
+              <w:t>1,080</w:t>
+            </w:r>
+          </w:p>
+        </w:tc>
+        <w:tc>
+          <w:tcPr>
+            <w:tcW w:type="dxa" w:w="1037"/>
             <w:tcBorders>
               <w:top w:val="single" w:sz="4" w:space="0" w:color="000000"/>
               <w:left w:val="single" w:sz="4" w:space="0" w:color="000000"/>
@@ -9354,20 +9591,21 @@
           </w:tcPr>
           <w:p>
             <w:pPr>
+              <w:keepNext/>
               <w:spacing w:after="0"/>
               <w:jc w:val="center"/>
             </w:pPr>
             <w:r>
               <w:rPr>
-                <w:sz w:val="17"/>
-              </w:rPr>
-              <w:t>2,000</w:t>
-            </w:r>
-          </w:p>
-        </w:tc>
-        <w:tc>
-          <w:tcPr>
-            <w:tcW w:type="dxa" w:w="1728"/>
+                <w:sz w:val="18"/>
+              </w:rPr>
+              <w:t>904</w:t>
+            </w:r>
+          </w:p>
+        </w:tc>
+        <w:tc>
+          <w:tcPr>
+            <w:tcW w:type="dxa" w:w="1152"/>
             <w:tcBorders>
               <w:top w:val="single" w:sz="4" w:space="0" w:color="000000"/>
               <w:left w:val="single" w:sz="4" w:space="0" w:color="000000"/>
@@ -9383,22 +9621,21 @@
           </w:tcPr>
           <w:p>
             <w:pPr>
+              <w:keepNext/>
               <w:spacing w:after="0"/>
               <w:jc w:val="center"/>
             </w:pPr>
             <w:r>
               <w:rPr>
-                <w:sz w:val="17"/>
-              </w:rPr>
-              <w:t>187</w:t>
-            </w:r>
-          </w:p>
-        </w:tc>
-      </w:tr>
-      <w:tr>
-        <w:tc>
-          <w:tcPr>
-            <w:tcW w:type="dxa" w:w="1584"/>
+                <w:sz w:val="18"/>
+              </w:rPr>
+              <w:t>976</w:t>
+            </w:r>
+          </w:p>
+        </w:tc>
+        <w:tc>
+          <w:tcPr>
+            <w:tcW w:type="dxa" w:w="893"/>
             <w:tcBorders>
               <w:top w:val="single" w:sz="4" w:space="0" w:color="000000"/>
               <w:left w:val="single" w:sz="4" w:space="0" w:color="000000"/>
@@ -9414,20 +9651,21 @@
           </w:tcPr>
           <w:p>
             <w:pPr>
+              <w:keepNext/>
               <w:spacing w:after="0"/>
               <w:jc w:val="center"/>
             </w:pPr>
             <w:r>
               <w:rPr>
-                <w:sz w:val="17"/>
-              </w:rPr>
-              <w:t>15</w:t>
-            </w:r>
-          </w:p>
-        </w:tc>
-        <w:tc>
-          <w:tcPr>
-            <w:tcW w:type="dxa" w:w="1584"/>
+                <w:sz w:val="18"/>
+              </w:rPr>
+              <w:t>17</w:t>
+            </w:r>
+          </w:p>
+        </w:tc>
+        <w:tc>
+          <w:tcPr>
+            <w:tcW w:type="dxa" w:w="1037"/>
             <w:tcBorders>
               <w:top w:val="single" w:sz="4" w:space="0" w:color="000000"/>
               <w:left w:val="single" w:sz="4" w:space="0" w:color="000000"/>
@@ -9443,20 +9681,21 @@
           </w:tcPr>
           <w:p>
             <w:pPr>
+              <w:keepNext/>
               <w:spacing w:after="0"/>
               <w:jc w:val="center"/>
             </w:pPr>
             <w:r>
               <w:rPr>
-                <w:sz w:val="17"/>
-              </w:rPr>
-              <w:t>48</w:t>
-            </w:r>
-          </w:p>
-        </w:tc>
-        <w:tc>
-          <w:tcPr>
-            <w:tcW w:type="dxa" w:w="1584"/>
+                <w:sz w:val="18"/>
+              </w:rPr>
+              <w:t>10</w:t>
+            </w:r>
+          </w:p>
+        </w:tc>
+        <w:tc>
+          <w:tcPr>
+            <w:tcW w:type="dxa" w:w="1037"/>
             <w:tcBorders>
               <w:top w:val="single" w:sz="4" w:space="0" w:color="000000"/>
               <w:left w:val="single" w:sz="4" w:space="0" w:color="000000"/>
@@ -9472,12 +9711,13 @@
           </w:tcPr>
           <w:p>
             <w:pPr>
+              <w:keepNext/>
               <w:spacing w:after="0"/>
               <w:jc w:val="center"/>
             </w:pPr>
             <w:r>
               <w:rPr>
-                <w:sz w:val="17"/>
+                <w:sz w:val="18"/>
               </w:rPr>
               <w:t>2,000</w:t>
             </w:r>
@@ -9485,7 +9725,7 @@
         </w:tc>
         <w:tc>
           <w:tcPr>
-            <w:tcW w:type="dxa" w:w="1728"/>
+            <w:tcW w:type="dxa" w:w="1152"/>
             <w:tcBorders>
               <w:top w:val="single" w:sz="4" w:space="0" w:color="000000"/>
               <w:left w:val="single" w:sz="4" w:space="0" w:color="000000"/>
@@ -9501,14 +9741,15 @@
           </w:tcPr>
           <w:p>
             <w:pPr>
+              <w:keepNext/>
               <w:spacing w:after="0"/>
               <w:jc w:val="center"/>
             </w:pPr>
             <w:r>
               <w:rPr>
-                <w:sz w:val="17"/>
-              </w:rPr>
-              <w:t>96</w:t>
+                <w:sz w:val="18"/>
+              </w:rPr>
+              <w:t>20</w:t>
             </w:r>
           </w:p>
         </w:tc>
@@ -9516,7 +9757,7 @@
       <w:tr>
         <w:tc>
           <w:tcPr>
-            <w:tcW w:type="dxa" w:w="1584"/>
+            <w:tcW w:type="dxa" w:w="893"/>
             <w:tcBorders>
               <w:top w:val="single" w:sz="4" w:space="0" w:color="000000"/>
               <w:left w:val="single" w:sz="4" w:space="0" w:color="000000"/>
@@ -9532,20 +9773,21 @@
           </w:tcPr>
           <w:p>
             <w:pPr>
+              <w:keepNext/>
               <w:spacing w:after="0"/>
               <w:jc w:val="center"/>
             </w:pPr>
             <w:r>
               <w:rPr>
-                <w:sz w:val="17"/>
-              </w:rPr>
-              <w:t>16</w:t>
-            </w:r>
-          </w:p>
-        </w:tc>
-        <w:tc>
-          <w:tcPr>
-            <w:tcW w:type="dxa" w:w="1584"/>
+                <w:sz w:val="18"/>
+              </w:rPr>
+              <w:t>8</w:t>
+            </w:r>
+          </w:p>
+        </w:tc>
+        <w:tc>
+          <w:tcPr>
+            <w:tcW w:type="dxa" w:w="1037"/>
             <w:tcBorders>
               <w:top w:val="single" w:sz="4" w:space="0" w:color="000000"/>
               <w:left w:val="single" w:sz="4" w:space="0" w:color="000000"/>
@@ -9561,20 +9803,21 @@
           </w:tcPr>
           <w:p>
             <w:pPr>
+              <w:keepNext/>
               <w:spacing w:after="0"/>
               <w:jc w:val="center"/>
             </w:pPr>
             <w:r>
               <w:rPr>
-                <w:sz w:val="17"/>
-              </w:rPr>
-              <w:t>23</w:t>
-            </w:r>
-          </w:p>
-        </w:tc>
-        <w:tc>
-          <w:tcPr>
-            <w:tcW w:type="dxa" w:w="1584"/>
+                <w:sz w:val="18"/>
+              </w:rPr>
+              <w:t>963</w:t>
+            </w:r>
+          </w:p>
+        </w:tc>
+        <w:tc>
+          <w:tcPr>
+            <w:tcW w:type="dxa" w:w="1037"/>
             <w:tcBorders>
               <w:top w:val="single" w:sz="4" w:space="0" w:color="000000"/>
               <w:left w:val="single" w:sz="4" w:space="0" w:color="000000"/>
@@ -9590,20 +9833,21 @@
           </w:tcPr>
           <w:p>
             <w:pPr>
+              <w:keepNext/>
               <w:spacing w:after="0"/>
               <w:jc w:val="center"/>
             </w:pPr>
             <w:r>
               <w:rPr>
-                <w:sz w:val="17"/>
-              </w:rPr>
-              <w:t>2,000</w:t>
-            </w:r>
-          </w:p>
-        </w:tc>
-        <w:tc>
-          <w:tcPr>
-            <w:tcW w:type="dxa" w:w="1728"/>
+                <w:sz w:val="18"/>
+              </w:rPr>
+              <w:t>1,349</w:t>
+            </w:r>
+          </w:p>
+        </w:tc>
+        <w:tc>
+          <w:tcPr>
+            <w:tcW w:type="dxa" w:w="1152"/>
             <w:tcBorders>
               <w:top w:val="single" w:sz="4" w:space="0" w:color="000000"/>
               <w:left w:val="single" w:sz="4" w:space="0" w:color="000000"/>
@@ -9619,22 +9863,21 @@
           </w:tcPr>
           <w:p>
             <w:pPr>
+              <w:keepNext/>
               <w:spacing w:after="0"/>
               <w:jc w:val="center"/>
             </w:pPr>
             <w:r>
               <w:rPr>
-                <w:sz w:val="17"/>
-              </w:rPr>
-              <w:t>46</w:t>
-            </w:r>
-          </w:p>
-        </w:tc>
-      </w:tr>
-      <w:tr>
-        <w:tc>
-          <w:tcPr>
-            <w:tcW w:type="dxa" w:w="1584"/>
+                <w:sz w:val="18"/>
+              </w:rPr>
+              <w:t>1,299</w:t>
+            </w:r>
+          </w:p>
+        </w:tc>
+        <w:tc>
+          <w:tcPr>
+            <w:tcW w:type="dxa" w:w="893"/>
             <w:tcBorders>
               <w:top w:val="single" w:sz="4" w:space="0" w:color="000000"/>
               <w:left w:val="single" w:sz="4" w:space="0" w:color="000000"/>
@@ -9650,20 +9893,21 @@
           </w:tcPr>
           <w:p>
             <w:pPr>
+              <w:keepNext/>
               <w:spacing w:after="0"/>
               <w:jc w:val="center"/>
             </w:pPr>
             <w:r>
               <w:rPr>
-                <w:sz w:val="17"/>
-              </w:rPr>
-              <w:t>17</w:t>
-            </w:r>
-          </w:p>
-        </w:tc>
-        <w:tc>
-          <w:tcPr>
-            <w:tcW w:type="dxa" w:w="1584"/>
+                <w:sz w:val="18"/>
+              </w:rPr>
+              <w:t>18</w:t>
+            </w:r>
+          </w:p>
+        </w:tc>
+        <w:tc>
+          <w:tcPr>
+            <w:tcW w:type="dxa" w:w="1037"/>
             <w:tcBorders>
               <w:top w:val="single" w:sz="4" w:space="0" w:color="000000"/>
               <w:left w:val="single" w:sz="4" w:space="0" w:color="000000"/>
@@ -9679,20 +9923,21 @@
           </w:tcPr>
           <w:p>
             <w:pPr>
+              <w:keepNext/>
               <w:spacing w:after="0"/>
               <w:jc w:val="center"/>
             </w:pPr>
             <w:r>
               <w:rPr>
-                <w:sz w:val="17"/>
-              </w:rPr>
-              <w:t>10</w:t>
-            </w:r>
-          </w:p>
-        </w:tc>
-        <w:tc>
-          <w:tcPr>
-            <w:tcW w:type="dxa" w:w="1584"/>
+                <w:sz w:val="18"/>
+              </w:rPr>
+              <w:t>4</w:t>
+            </w:r>
+          </w:p>
+        </w:tc>
+        <w:tc>
+          <w:tcPr>
+            <w:tcW w:type="dxa" w:w="1037"/>
             <w:tcBorders>
               <w:top w:val="single" w:sz="4" w:space="0" w:color="000000"/>
               <w:left w:val="single" w:sz="4" w:space="0" w:color="000000"/>
@@ -9708,12 +9953,13 @@
           </w:tcPr>
           <w:p>
             <w:pPr>
+              <w:keepNext/>
               <w:spacing w:after="0"/>
               <w:jc w:val="center"/>
             </w:pPr>
             <w:r>
               <w:rPr>
-                <w:sz w:val="17"/>
+                <w:sz w:val="18"/>
               </w:rPr>
               <w:t>2,000</w:t>
             </w:r>
@@ -9721,7 +9967,7 @@
         </w:tc>
         <w:tc>
           <w:tcPr>
-            <w:tcW w:type="dxa" w:w="1728"/>
+            <w:tcW w:type="dxa" w:w="1152"/>
             <w:tcBorders>
               <w:top w:val="single" w:sz="4" w:space="0" w:color="000000"/>
               <w:left w:val="single" w:sz="4" w:space="0" w:color="000000"/>
@@ -9737,14 +9983,15 @@
           </w:tcPr>
           <w:p>
             <w:pPr>
+              <w:keepNext/>
               <w:spacing w:after="0"/>
               <w:jc w:val="center"/>
             </w:pPr>
             <w:r>
               <w:rPr>
-                <w:sz w:val="17"/>
-              </w:rPr>
-              <w:t>20</w:t>
+                <w:sz w:val="18"/>
+              </w:rPr>
+              <w:t>8</w:t>
             </w:r>
           </w:p>
         </w:tc>
@@ -9752,7 +9999,7 @@
       <w:tr>
         <w:tc>
           <w:tcPr>
-            <w:tcW w:type="dxa" w:w="1584"/>
+            <w:tcW w:type="dxa" w:w="893"/>
             <w:tcBorders>
               <w:top w:val="single" w:sz="4" w:space="0" w:color="000000"/>
               <w:left w:val="single" w:sz="4" w:space="0" w:color="000000"/>
@@ -9768,20 +10015,21 @@
           </w:tcPr>
           <w:p>
             <w:pPr>
+              <w:keepNext/>
               <w:spacing w:after="0"/>
               <w:jc w:val="center"/>
             </w:pPr>
             <w:r>
               <w:rPr>
-                <w:sz w:val="17"/>
-              </w:rPr>
-              <w:t>18</w:t>
-            </w:r>
-          </w:p>
-        </w:tc>
-        <w:tc>
-          <w:tcPr>
-            <w:tcW w:type="dxa" w:w="1584"/>
+                <w:sz w:val="18"/>
+              </w:rPr>
+              <w:t>9</w:t>
+            </w:r>
+          </w:p>
+        </w:tc>
+        <w:tc>
+          <w:tcPr>
+            <w:tcW w:type="dxa" w:w="1037"/>
             <w:tcBorders>
               <w:top w:val="single" w:sz="4" w:space="0" w:color="000000"/>
               <w:left w:val="single" w:sz="4" w:space="0" w:color="000000"/>
@@ -9797,20 +10045,21 @@
           </w:tcPr>
           <w:p>
             <w:pPr>
+              <w:keepNext/>
               <w:spacing w:after="0"/>
               <w:jc w:val="center"/>
             </w:pPr>
             <w:r>
               <w:rPr>
-                <w:sz w:val="17"/>
-              </w:rPr>
-              <w:t>4</w:t>
-            </w:r>
-          </w:p>
-        </w:tc>
-        <w:tc>
-          <w:tcPr>
-            <w:tcW w:type="dxa" w:w="1584"/>
+                <w:sz w:val="18"/>
+              </w:rPr>
+              <w:t>793</w:t>
+            </w:r>
+          </w:p>
+        </w:tc>
+        <w:tc>
+          <w:tcPr>
+            <w:tcW w:type="dxa" w:w="1037"/>
             <w:tcBorders>
               <w:top w:val="single" w:sz="4" w:space="0" w:color="000000"/>
               <w:left w:val="single" w:sz="4" w:space="0" w:color="000000"/>
@@ -9826,20 +10075,21 @@
           </w:tcPr>
           <w:p>
             <w:pPr>
+              <w:keepNext/>
               <w:spacing w:after="0"/>
               <w:jc w:val="center"/>
             </w:pPr>
             <w:r>
               <w:rPr>
-                <w:sz w:val="17"/>
-              </w:rPr>
-              <w:t>2,000</w:t>
-            </w:r>
-          </w:p>
-        </w:tc>
-        <w:tc>
-          <w:tcPr>
-            <w:tcW w:type="dxa" w:w="1728"/>
+                <w:sz w:val="18"/>
+              </w:rPr>
+              <w:t>1,774</w:t>
+            </w:r>
+          </w:p>
+        </w:tc>
+        <w:tc>
+          <w:tcPr>
+            <w:tcW w:type="dxa" w:w="1152"/>
             <w:tcBorders>
               <w:top w:val="single" w:sz="4" w:space="0" w:color="000000"/>
               <w:left w:val="single" w:sz="4" w:space="0" w:color="000000"/>
@@ -9855,22 +10105,21 @@
           </w:tcPr>
           <w:p>
             <w:pPr>
+              <w:keepNext/>
               <w:spacing w:after="0"/>
               <w:jc w:val="center"/>
             </w:pPr>
             <w:r>
               <w:rPr>
-                <w:sz w:val="17"/>
-              </w:rPr>
-              <w:t>8</w:t>
-            </w:r>
-          </w:p>
-        </w:tc>
-      </w:tr>
-      <w:tr>
-        <w:tc>
-          <w:tcPr>
-            <w:tcW w:type="dxa" w:w="1584"/>
+                <w:sz w:val="18"/>
+              </w:rPr>
+              <w:t>1,407</w:t>
+            </w:r>
+          </w:p>
+        </w:tc>
+        <w:tc>
+          <w:tcPr>
+            <w:tcW w:type="dxa" w:w="893"/>
             <w:tcBorders>
               <w:top w:val="single" w:sz="4" w:space="0" w:color="000000"/>
               <w:left w:val="single" w:sz="4" w:space="0" w:color="000000"/>
@@ -9886,12 +10135,13 @@
           </w:tcPr>
           <w:p>
             <w:pPr>
+              <w:keepNext/>
               <w:spacing w:after="0"/>
               <w:jc w:val="center"/>
             </w:pPr>
             <w:r>
               <w:rPr>
-                <w:sz w:val="17"/>
+                <w:sz w:val="18"/>
               </w:rPr>
               <w:t>19</w:t>
             </w:r>
@@ -9899,7 +10149,7 @@
         </w:tc>
         <w:tc>
           <w:tcPr>
-            <w:tcW w:type="dxa" w:w="1584"/>
+            <w:tcW w:type="dxa" w:w="1037"/>
             <w:tcBorders>
               <w:top w:val="single" w:sz="4" w:space="0" w:color="000000"/>
               <w:left w:val="single" w:sz="4" w:space="0" w:color="000000"/>
@@ -9915,12 +10165,13 @@
           </w:tcPr>
           <w:p>
             <w:pPr>
+              <w:keepNext/>
               <w:spacing w:after="0"/>
               <w:jc w:val="center"/>
             </w:pPr>
             <w:r>
               <w:rPr>
-                <w:sz w:val="17"/>
+                <w:sz w:val="18"/>
               </w:rPr>
               <w:t>1</w:t>
             </w:r>
@@ -9928,7 +10179,7 @@
         </w:tc>
         <w:tc>
           <w:tcPr>
-            <w:tcW w:type="dxa" w:w="1584"/>
+            <w:tcW w:type="dxa" w:w="1037"/>
             <w:tcBorders>
               <w:top w:val="single" w:sz="4" w:space="0" w:color="000000"/>
               <w:left w:val="single" w:sz="4" w:space="0" w:color="000000"/>
@@ -9944,12 +10195,13 @@
           </w:tcPr>
           <w:p>
             <w:pPr>
+              <w:keepNext/>
               <w:spacing w:after="0"/>
               <w:jc w:val="center"/>
             </w:pPr>
             <w:r>
               <w:rPr>
-                <w:sz w:val="17"/>
+                <w:sz w:val="18"/>
               </w:rPr>
               <w:t>2,000</w:t>
             </w:r>
@@ -9957,7 +10209,7 @@
         </w:tc>
         <w:tc>
           <w:tcPr>
-            <w:tcW w:type="dxa" w:w="1728"/>
+            <w:tcW w:type="dxa" w:w="1152"/>
             <w:tcBorders>
               <w:top w:val="single" w:sz="4" w:space="0" w:color="000000"/>
               <w:left w:val="single" w:sz="4" w:space="0" w:color="000000"/>
@@ -9973,12 +10225,13 @@
           </w:tcPr>
           <w:p>
             <w:pPr>
+              <w:keepNext/>
               <w:spacing w:after="0"/>
               <w:jc w:val="center"/>
             </w:pPr>
             <w:r>
               <w:rPr>
-                <w:sz w:val="17"/>
+                <w:sz w:val="18"/>
               </w:rPr>
               <w:t>3</w:t>
             </w:r>
@@ -9988,7 +10241,7 @@
       <w:tr>
         <w:tc>
           <w:tcPr>
-            <w:tcW w:type="dxa" w:w="1584"/>
+            <w:tcW w:type="dxa" w:w="893"/>
             <w:tcBorders>
               <w:top w:val="single" w:sz="4" w:space="0" w:color="000000"/>
               <w:left w:val="single" w:sz="4" w:space="0" w:color="000000"/>
@@ -10004,20 +10257,21 @@
           </w:tcPr>
           <w:p>
             <w:pPr>
+              <w:keepNext/>
               <w:spacing w:after="0"/>
               <w:jc w:val="center"/>
             </w:pPr>
             <w:r>
               <w:rPr>
-                <w:sz w:val="17"/>
-              </w:rPr>
-              <w:t>20</w:t>
-            </w:r>
-          </w:p>
-        </w:tc>
-        <w:tc>
-          <w:tcPr>
-            <w:tcW w:type="dxa" w:w="1584"/>
+                <w:sz w:val="18"/>
+              </w:rPr>
+              <w:t>10</w:t>
+            </w:r>
+          </w:p>
+        </w:tc>
+        <w:tc>
+          <w:tcPr>
+            <w:tcW w:type="dxa" w:w="1037"/>
             <w:tcBorders>
               <w:top w:val="single" w:sz="4" w:space="0" w:color="000000"/>
               <w:left w:val="single" w:sz="4" w:space="0" w:color="000000"/>
@@ -10033,20 +10287,21 @@
           </w:tcPr>
           <w:p>
             <w:pPr>
+              <w:keepNext/>
               <w:spacing w:after="0"/>
               <w:jc w:val="center"/>
             </w:pPr>
             <w:r>
               <w:rPr>
-                <w:sz w:val="17"/>
-              </w:rPr>
-              <w:t>1</w:t>
-            </w:r>
-          </w:p>
-        </w:tc>
-        <w:tc>
-          <w:tcPr>
-            <w:tcW w:type="dxa" w:w="1584"/>
+                <w:sz w:val="18"/>
+              </w:rPr>
+              <w:t>604</w:t>
+            </w:r>
+          </w:p>
+        </w:tc>
+        <w:tc>
+          <w:tcPr>
+            <w:tcW w:type="dxa" w:w="1037"/>
             <w:tcBorders>
               <w:top w:val="single" w:sz="4" w:space="0" w:color="000000"/>
               <w:left w:val="single" w:sz="4" w:space="0" w:color="000000"/>
@@ -10062,20 +10317,21 @@
           </w:tcPr>
           <w:p>
             <w:pPr>
+              <w:keepNext/>
               <w:spacing w:after="0"/>
               <w:jc w:val="center"/>
             </w:pPr>
             <w:r>
               <w:rPr>
-                <w:sz w:val="17"/>
-              </w:rPr>
-              <w:t>0</w:t>
-            </w:r>
-          </w:p>
-        </w:tc>
-        <w:tc>
-          <w:tcPr>
-            <w:tcW w:type="dxa" w:w="1728"/>
+                <w:sz w:val="18"/>
+              </w:rPr>
+              <w:t>1,970</w:t>
+            </w:r>
+          </w:p>
+        </w:tc>
+        <w:tc>
+          <w:tcPr>
+            <w:tcW w:type="dxa" w:w="1152"/>
             <w:tcBorders>
               <w:top w:val="single" w:sz="4" w:space="0" w:color="000000"/>
               <w:left w:val="single" w:sz="4" w:space="0" w:color="000000"/>
@@ -10091,22 +10347,21 @@
           </w:tcPr>
           <w:p>
             <w:pPr>
+              <w:keepNext/>
               <w:spacing w:after="0"/>
               <w:jc w:val="center"/>
             </w:pPr>
             <w:r>
               <w:rPr>
-                <w:sz w:val="17"/>
-              </w:rPr>
-              <w:t>0</w:t>
-            </w:r>
-          </w:p>
-        </w:tc>
-      </w:tr>
-      <w:tr>
-        <w:tc>
-          <w:tcPr>
-            <w:tcW w:type="dxa" w:w="1584"/>
+                <w:sz w:val="18"/>
+              </w:rPr>
+              <w:t>1,190</w:t>
+            </w:r>
+          </w:p>
+        </w:tc>
+        <w:tc>
+          <w:tcPr>
+            <w:tcW w:type="dxa" w:w="893"/>
             <w:tcBorders>
               <w:top w:val="single" w:sz="4" w:space="0" w:color="000000"/>
               <w:left w:val="single" w:sz="4" w:space="0" w:color="000000"/>
@@ -10122,20 +10377,21 @@
           </w:tcPr>
           <w:p>
             <w:pPr>
+              <w:keepNext/>
               <w:spacing w:after="0"/>
               <w:jc w:val="center"/>
             </w:pPr>
             <w:r>
               <w:rPr>
-                <w:sz w:val="17"/>
-              </w:rPr>
-              <w:t>Total</w:t>
-            </w:r>
-          </w:p>
-        </w:tc>
-        <w:tc>
-          <w:tcPr>
-            <w:tcW w:type="dxa" w:w="1584"/>
+                <w:sz w:val="18"/>
+              </w:rPr>
+              <w:t>20</w:t>
+            </w:r>
+          </w:p>
+        </w:tc>
+        <w:tc>
+          <w:tcPr>
+            <w:tcW w:type="dxa" w:w="1037"/>
             <w:tcBorders>
               <w:top w:val="single" w:sz="4" w:space="0" w:color="000000"/>
               <w:left w:val="single" w:sz="4" w:space="0" w:color="000000"/>
@@ -10151,20 +10407,21 @@
           </w:tcPr>
           <w:p>
             <w:pPr>
+              <w:keepNext/>
               <w:spacing w:after="0"/>
               <w:jc w:val="center"/>
             </w:pPr>
             <w:r>
               <w:rPr>
-                <w:sz w:val="17"/>
-              </w:rPr>
-              <w:t>8,755</w:t>
-            </w:r>
-          </w:p>
-        </w:tc>
-        <w:tc>
-          <w:tcPr>
-            <w:tcW w:type="dxa" w:w="1584"/>
+                <w:sz w:val="18"/>
+              </w:rPr>
+              <w:t>1</w:t>
+            </w:r>
+          </w:p>
+        </w:tc>
+        <w:tc>
+          <w:tcPr>
+            <w:tcW w:type="dxa" w:w="1037"/>
             <w:tcBorders>
               <w:top w:val="single" w:sz="4" w:space="0" w:color="000000"/>
               <w:left w:val="single" w:sz="4" w:space="0" w:color="000000"/>
@@ -10180,14 +10437,21 @@
           </w:tcPr>
           <w:p>
             <w:pPr>
+              <w:keepNext/>
               <w:spacing w:after="0"/>
               <w:jc w:val="center"/>
             </w:pPr>
-          </w:p>
-        </w:tc>
-        <w:tc>
-          <w:tcPr>
-            <w:tcW w:type="dxa" w:w="1728"/>
+            <w:r>
+              <w:rPr>
+                <w:sz w:val="18"/>
+              </w:rPr>
+              <w:t>0</w:t>
+            </w:r>
+          </w:p>
+        </w:tc>
+        <w:tc>
+          <w:tcPr>
+            <w:tcW w:type="dxa" w:w="1152"/>
             <w:tcBorders>
               <w:top w:val="single" w:sz="4" w:space="0" w:color="000000"/>
               <w:left w:val="single" w:sz="4" w:space="0" w:color="000000"/>
@@ -10203,13 +10467,226 @@
           </w:tcPr>
           <w:p>
             <w:pPr>
+              <w:keepNext/>
               <w:spacing w:after="0"/>
               <w:jc w:val="center"/>
             </w:pPr>
             <w:r>
               <w:rPr>
+                <w:sz w:val="18"/>
+              </w:rPr>
+              <w:t>0</w:t>
+            </w:r>
+          </w:p>
+        </w:tc>
+      </w:tr>
+      <w:tr>
+        <w:tc>
+          <w:tcPr>
+            <w:tcW w:type="dxa" w:w="893"/>
+            <w:tcBorders>
+              <w:top w:val="single" w:sz="4" w:space="0" w:color="000000"/>
+              <w:left w:val="single" w:sz="4" w:space="0" w:color="000000"/>
+              <w:bottom w:val="single" w:sz="4" w:space="0" w:color="000000"/>
+              <w:right w:val="single" w:sz="4" w:space="0" w:color="000000"/>
+            </w:tcBorders>
+            <w:tcMar>
+              <w:top w:w="30" w:type="dxa"/>
+              <w:left w:w="80" w:type="dxa"/>
+              <w:bottom w:w="30" w:type="dxa"/>
+              <w:right w:w="80" w:type="dxa"/>
+            </w:tcMar>
+          </w:tcPr>
+          <w:p>
+            <w:pPr>
+              <w:keepNext/>
+              <w:spacing w:after="0"/>
+              <w:jc w:val="center"/>
+            </w:pPr>
+          </w:p>
+        </w:tc>
+        <w:tc>
+          <w:tcPr>
+            <w:tcW w:type="dxa" w:w="1037"/>
+            <w:tcBorders>
+              <w:top w:val="single" w:sz="4" w:space="0" w:color="000000"/>
+              <w:left w:val="single" w:sz="4" w:space="0" w:color="000000"/>
+              <w:bottom w:val="single" w:sz="4" w:space="0" w:color="000000"/>
+              <w:right w:val="single" w:sz="4" w:space="0" w:color="000000"/>
+            </w:tcBorders>
+            <w:tcMar>
+              <w:top w:w="30" w:type="dxa"/>
+              <w:left w:w="80" w:type="dxa"/>
+              <w:bottom w:w="30" w:type="dxa"/>
+              <w:right w:w="80" w:type="dxa"/>
+            </w:tcMar>
+          </w:tcPr>
+          <w:p>
+            <w:pPr>
+              <w:keepNext/>
+              <w:spacing w:after="0"/>
+              <w:jc w:val="center"/>
+            </w:pPr>
+          </w:p>
+        </w:tc>
+        <w:tc>
+          <w:tcPr>
+            <w:tcW w:type="dxa" w:w="1037"/>
+            <w:tcBorders>
+              <w:top w:val="single" w:sz="4" w:space="0" w:color="000000"/>
+              <w:left w:val="single" w:sz="4" w:space="0" w:color="000000"/>
+              <w:bottom w:val="single" w:sz="4" w:space="0" w:color="000000"/>
+              <w:right w:val="single" w:sz="4" w:space="0" w:color="000000"/>
+            </w:tcBorders>
+            <w:tcMar>
+              <w:top w:w="30" w:type="dxa"/>
+              <w:left w:w="80" w:type="dxa"/>
+              <w:bottom w:w="30" w:type="dxa"/>
+              <w:right w:w="80" w:type="dxa"/>
+            </w:tcMar>
+          </w:tcPr>
+          <w:p>
+            <w:pPr>
+              <w:keepNext/>
+              <w:spacing w:after="0"/>
+              <w:jc w:val="center"/>
+            </w:pPr>
+          </w:p>
+        </w:tc>
+        <w:tc>
+          <w:tcPr>
+            <w:tcW w:type="dxa" w:w="1152"/>
+            <w:tcBorders>
+              <w:top w:val="single" w:sz="4" w:space="0" w:color="000000"/>
+              <w:left w:val="single" w:sz="4" w:space="0" w:color="000000"/>
+              <w:bottom w:val="single" w:sz="4" w:space="0" w:color="000000"/>
+              <w:right w:val="single" w:sz="4" w:space="0" w:color="000000"/>
+            </w:tcBorders>
+            <w:tcMar>
+              <w:top w:w="30" w:type="dxa"/>
+              <w:left w:w="80" w:type="dxa"/>
+              <w:bottom w:w="30" w:type="dxa"/>
+              <w:right w:w="80" w:type="dxa"/>
+            </w:tcMar>
+          </w:tcPr>
+          <w:p>
+            <w:pPr>
+              <w:keepNext/>
+              <w:spacing w:after="0"/>
+              <w:jc w:val="center"/>
+            </w:pPr>
+          </w:p>
+        </w:tc>
+        <w:tc>
+          <w:tcPr>
+            <w:tcW w:type="dxa" w:w="893"/>
+            <w:tcBorders>
+              <w:top w:val="single" w:sz="4" w:space="0" w:color="000000"/>
+              <w:left w:val="single" w:sz="4" w:space="0" w:color="000000"/>
+              <w:bottom w:val="single" w:sz="4" w:space="0" w:color="000000"/>
+              <w:right w:val="single" w:sz="4" w:space="0" w:color="000000"/>
+            </w:tcBorders>
+            <w:tcMar>
+              <w:top w:w="30" w:type="dxa"/>
+              <w:left w:w="80" w:type="dxa"/>
+              <w:bottom w:w="30" w:type="dxa"/>
+              <w:right w:w="80" w:type="dxa"/>
+            </w:tcMar>
+          </w:tcPr>
+          <w:p>
+            <w:pPr>
+              <w:keepNext/>
+              <w:spacing w:after="0"/>
+              <w:jc w:val="center"/>
+            </w:pPr>
+            <w:r>
+              <w:rPr>
+                <w:sz w:val="18"/>
+              </w:rPr>
+              <w:t>Total</w:t>
+            </w:r>
+          </w:p>
+        </w:tc>
+        <w:tc>
+          <w:tcPr>
+            <w:tcW w:type="dxa" w:w="1037"/>
+            <w:tcBorders>
+              <w:top w:val="single" w:sz="4" w:space="0" w:color="000000"/>
+              <w:left w:val="single" w:sz="4" w:space="0" w:color="000000"/>
+              <w:bottom w:val="single" w:sz="4" w:space="0" w:color="000000"/>
+              <w:right w:val="single" w:sz="4" w:space="0" w:color="000000"/>
+            </w:tcBorders>
+            <w:tcMar>
+              <w:top w:w="30" w:type="dxa"/>
+              <w:left w:w="80" w:type="dxa"/>
+              <w:bottom w:w="30" w:type="dxa"/>
+              <w:right w:w="80" w:type="dxa"/>
+            </w:tcMar>
+          </w:tcPr>
+          <w:p>
+            <w:pPr>
+              <w:keepNext/>
+              <w:spacing w:after="0"/>
+              <w:jc w:val="center"/>
+            </w:pPr>
+            <w:r>
+              <w:rPr>
+                <w:sz w:val="18"/>
+              </w:rPr>
+              <w:t>8,755</w:t>
+            </w:r>
+          </w:p>
+        </w:tc>
+        <w:tc>
+          <w:tcPr>
+            <w:tcW w:type="dxa" w:w="1037"/>
+            <w:tcBorders>
+              <w:top w:val="single" w:sz="4" w:space="0" w:color="000000"/>
+              <w:left w:val="single" w:sz="4" w:space="0" w:color="000000"/>
+              <w:bottom w:val="single" w:sz="4" w:space="0" w:color="000000"/>
+              <w:right w:val="single" w:sz="4" w:space="0" w:color="000000"/>
+            </w:tcBorders>
+            <w:tcMar>
+              <w:top w:w="30" w:type="dxa"/>
+              <w:left w:w="80" w:type="dxa"/>
+              <w:bottom w:w="30" w:type="dxa"/>
+              <w:right w:w="80" w:type="dxa"/>
+            </w:tcMar>
+          </w:tcPr>
+          <w:p>
+            <w:pPr>
+              <w:keepNext/>
+              <w:spacing w:after="0"/>
+              <w:jc w:val="center"/>
+            </w:pPr>
+          </w:p>
+        </w:tc>
+        <w:tc>
+          <w:tcPr>
+            <w:tcW w:type="dxa" w:w="1152"/>
+            <w:tcBorders>
+              <w:top w:val="single" w:sz="4" w:space="0" w:color="000000"/>
+              <w:left w:val="single" w:sz="4" w:space="0" w:color="000000"/>
+              <w:bottom w:val="single" w:sz="4" w:space="0" w:color="000000"/>
+              <w:right w:val="single" w:sz="4" w:space="0" w:color="000000"/>
+            </w:tcBorders>
+            <w:tcMar>
+              <w:top w:w="30" w:type="dxa"/>
+              <w:left w:w="80" w:type="dxa"/>
+              <w:bottom w:w="30" w:type="dxa"/>
+              <w:right w:w="80" w:type="dxa"/>
+            </w:tcMar>
+          </w:tcPr>
+          <w:p>
+            <w:pPr>
+              <w:keepNext/>
+              <w:spacing w:after="0"/>
+              <w:jc w:val="center"/>
+            </w:pPr>
+            <w:r>
+              <w:rPr>
                 <w:b/>
-                <w:sz w:val="17"/>
+                <w:sz w:val="18"/>
               </w:rPr>
               <w:t>8,063</w:t>
             </w:r>
@@ -10326,6 +10803,7 @@
           </w:tcPr>
           <w:p>
             <w:pPr>
+              <w:keepNext/>
               <w:rPr/>
             </w:pPr>
             <w:r>
@@ -10364,6 +10842,7 @@
           </w:tcPr>
           <w:p>
             <w:pPr>
+              <w:keepNext/>
               <w:rPr/>
             </w:pPr>
             <w:r>
@@ -10402,6 +10881,7 @@
           </w:tcPr>
           <w:p>
             <w:pPr>
+              <w:keepNext/>
               <w:rPr/>
             </w:pPr>
             <w:r>
@@ -10445,6 +10925,7 @@
           </w:tcPr>
           <w:p>
             <w:pPr>
+              <w:keepNext/>
               <w:rPr/>
             </w:pPr>
             <w:r>
@@ -10479,6 +10960,7 @@
           </w:tcPr>
           <w:p>
             <w:pPr>
+              <w:keepNext/>
               <w:rPr/>
             </w:pPr>
             <w:r>
@@ -10506,6 +10988,7 @@
           </w:tcPr>
           <w:p>
             <w:pPr>
+              <w:keepNext/>
               <w:rPr/>
             </w:pPr>
             <w:r>
@@ -10539,6 +11022,7 @@
           </w:tcPr>
           <w:p>
             <w:pPr>
+              <w:keepNext/>
               <w:rPr/>
             </w:pPr>
             <w:r>
@@ -10573,6 +11057,7 @@
           </w:tcPr>
           <w:p>
             <w:pPr>
+              <w:keepNext/>
               <w:rPr/>
             </w:pPr>
             <w:r>
@@ -10600,6 +11085,7 @@
           </w:tcPr>
           <w:p>
             <w:pPr>
+              <w:keepNext/>
               <w:rPr/>
             </w:pPr>
             <w:r>
@@ -10633,6 +11119,7 @@
           </w:tcPr>
           <w:p>
             <w:pPr>
+              <w:keepNext/>
               <w:rPr/>
             </w:pPr>
             <w:r>
@@ -10667,6 +11154,7 @@
           </w:tcPr>
           <w:p>
             <w:pPr>
+              <w:keepNext/>
               <w:rPr/>
             </w:pPr>
             <w:r>
@@ -10694,6 +11182,7 @@
           </w:tcPr>
           <w:p>
             <w:pPr>
+              <w:keepNext/>
               <w:rPr/>
             </w:pPr>
             <w:r>
@@ -11537,6 +12026,7 @@
           </w:tcPr>
           <w:p>
             <w:pPr>
+              <w:keepNext/>
               <w:rPr/>
             </w:pPr>
             <w:r>
@@ -11575,6 +12065,7 @@
           </w:tcPr>
           <w:p>
             <w:pPr>
+              <w:keepNext/>
               <w:rPr/>
             </w:pPr>
             <w:r>
@@ -11613,6 +12104,7 @@
           </w:tcPr>
           <w:p>
             <w:pPr>
+              <w:keepNext/>
               <w:rPr/>
             </w:pPr>
             <w:r>
@@ -11656,6 +12148,7 @@
           </w:tcPr>
           <w:p>
             <w:pPr>
+              <w:keepNext/>
               <w:rPr/>
             </w:pPr>
             <w:r>
@@ -11690,6 +12183,7 @@
           </w:tcPr>
           <w:p>
             <w:pPr>
+              <w:keepNext/>
               <w:rPr/>
             </w:pPr>
             <w:r>
@@ -11717,6 +12211,7 @@
           </w:tcPr>
           <w:p>
             <w:pPr>
+              <w:keepNext/>
               <w:rPr/>
             </w:pPr>
             <w:r>
@@ -11750,6 +12245,7 @@
           </w:tcPr>
           <w:p>
             <w:pPr>
+              <w:keepNext/>
               <w:rPr/>
             </w:pPr>
             <w:r>
@@ -11784,6 +12280,7 @@
           </w:tcPr>
           <w:p>
             <w:pPr>
+              <w:keepNext/>
               <w:rPr/>
             </w:pPr>
             <w:r>
@@ -11811,6 +12308,7 @@
           </w:tcPr>
           <w:p>
             <w:pPr>
+              <w:keepNext/>
               <w:rPr/>
             </w:pPr>
             <w:r>
@@ -11844,6 +12342,7 @@
           </w:tcPr>
           <w:p>
             <w:pPr>
+              <w:keepNext/>
               <w:rPr/>
             </w:pPr>
             <w:r>
@@ -11878,6 +12377,7 @@
           </w:tcPr>
           <w:p>
             <w:pPr>
+              <w:keepNext/>
               <w:rPr/>
             </w:pPr>
             <w:r>
@@ -11905,6 +12405,7 @@
           </w:tcPr>
           <w:p>
             <w:pPr>
+              <w:keepNext/>
               <w:rPr/>
             </w:pPr>
             <w:r>
@@ -11945,6 +12446,7 @@
           </w:tcPr>
           <w:p>
             <w:pPr>
+              <w:keepNext/>
               <w:rPr/>
             </w:pPr>
             <w:r>
@@ -11979,6 +12481,7 @@
           </w:tcPr>
           <w:p>
             <w:pPr>
+              <w:keepNext/>
               <w:rPr/>
             </w:pPr>
             <w:r>
@@ -12013,6 +12516,7 @@
           </w:tcPr>
           <w:p>
             <w:pPr>
+              <w:keepNext/>
               <w:rPr/>
             </w:pPr>
             <w:r>
@@ -12053,6 +12557,7 @@
           </w:tcPr>
           <w:p>
             <w:pPr>
+              <w:keepNext/>
               <w:rPr/>
             </w:pPr>
             <w:r>
@@ -12087,6 +12592,7 @@
           </w:tcPr>
           <w:p>
             <w:pPr>
+              <w:keepNext/>
               <w:rPr/>
             </w:pPr>
             <w:r>
@@ -12114,6 +12620,7 @@
           </w:tcPr>
           <w:p>
             <w:pPr>
+              <w:keepNext/>
               <w:rPr/>
             </w:pPr>
             <w:r>
@@ -12979,6 +13486,7 @@
           </w:tcPr>
           <w:p>
             <w:pPr>
+              <w:keepNext/>
               <w:rPr/>
             </w:pPr>
             <w:r>
@@ -13017,6 +13525,7 @@
           </w:tcPr>
           <w:p>
             <w:pPr>
+              <w:keepNext/>
               <w:rPr/>
             </w:pPr>
             <w:r>
@@ -13055,6 +13564,7 @@
           </w:tcPr>
           <w:p>
             <w:pPr>
+              <w:keepNext/>
               <w:rPr/>
             </w:pPr>
             <w:r>
@@ -13098,6 +13608,7 @@
           </w:tcPr>
           <w:p>
             <w:pPr>
+              <w:keepNext/>
               <w:rPr/>
             </w:pPr>
             <w:r>
@@ -13132,6 +13643,7 @@
           </w:tcPr>
           <w:p>
             <w:pPr>
+              <w:keepNext/>
               <w:rPr/>
             </w:pPr>
             <w:r>
@@ -13159,6 +13671,7 @@
           </w:tcPr>
           <w:p>
             <w:pPr>
+              <w:keepNext/>
               <w:rPr/>
             </w:pPr>
             <w:r>
@@ -13192,6 +13705,7 @@
           </w:tcPr>
           <w:p>
             <w:pPr>
+              <w:keepNext/>
               <w:rPr/>
             </w:pPr>
             <w:r>
@@ -13226,6 +13740,7 @@
           </w:tcPr>
           <w:p>
             <w:pPr>
+              <w:keepNext/>
               <w:rPr/>
             </w:pPr>
             <w:r>
@@ -13253,6 +13768,7 @@
           </w:tcPr>
           <w:p>
             <w:pPr>
+              <w:keepNext/>
               <w:rPr/>
             </w:pPr>
             <w:r>
@@ -13286,6 +13802,7 @@
           </w:tcPr>
           <w:p>
             <w:pPr>
+              <w:keepNext/>
               <w:rPr/>
             </w:pPr>
             <w:r>
@@ -13320,6 +13837,7 @@
           </w:tcPr>
           <w:p>
             <w:pPr>
+              <w:keepNext/>
               <w:rPr/>
             </w:pPr>
             <w:r>
@@ -13347,6 +13865,7 @@
           </w:tcPr>
           <w:p>
             <w:pPr>
+              <w:keepNext/>
               <w:rPr/>
             </w:pPr>
             <w:r>
@@ -13380,6 +13899,7 @@
           </w:tcPr>
           <w:p>
             <w:pPr>
+              <w:keepNext/>
               <w:rPr/>
             </w:pPr>
             <w:r>
@@ -13414,6 +13934,7 @@
           </w:tcPr>
           <w:p>
             <w:pPr>
+              <w:keepNext/>
               <w:rPr/>
             </w:pPr>
             <w:r>
@@ -13441,6 +13962,7 @@
           </w:tcPr>
           <w:p>
             <w:pPr>
+              <w:keepNext/>
               <w:rPr/>
             </w:pPr>
             <w:r>
@@ -13582,6 +14104,7 @@
           </w:tcPr>
           <w:p>
             <w:pPr>
+              <w:keepNext/>
               <w:rPr/>
             </w:pPr>
             <w:r>
@@ -13620,6 +14143,7 @@
           </w:tcPr>
           <w:p>
             <w:pPr>
+              <w:keepNext/>
               <w:rPr/>
             </w:pPr>
             <w:r>
@@ -13658,6 +14182,7 @@
           </w:tcPr>
           <w:p>
             <w:pPr>
+              <w:keepNext/>
               <w:rPr/>
             </w:pPr>
             <w:r>
@@ -13696,6 +14221,7 @@
           </w:tcPr>
           <w:p>
             <w:pPr>
+              <w:keepNext/>
               <w:rPr/>
             </w:pPr>
             <w:r>
@@ -13739,6 +14265,7 @@
           </w:tcPr>
           <w:p>
             <w:pPr>
+              <w:keepNext/>
               <w:rPr/>
             </w:pPr>
             <w:r>
@@ -13773,6 +14300,7 @@
           </w:tcPr>
           <w:p>
             <w:pPr>
+              <w:keepNext/>
               <w:rPr/>
             </w:pPr>
             <w:r>
@@ -13807,6 +14335,7 @@
           </w:tcPr>
           <w:p>
             <w:pPr>
+              <w:keepNext/>
               <w:jc w:val="center"/>
               <w:rPr/>
             </w:pPr>
@@ -13835,6 +14364,7 @@
           </w:tcPr>
           <w:p>
             <w:pPr>
+              <w:keepNext/>
               <w:rPr/>
             </w:pPr>
             <w:r>
@@ -13868,6 +14398,7 @@
           </w:tcPr>
           <w:p>
             <w:pPr>
+              <w:keepNext/>
               <w:rPr/>
             </w:pPr>
             <w:r>
@@ -13902,6 +14433,7 @@
           </w:tcPr>
           <w:p>
             <w:pPr>
+              <w:keepNext/>
               <w:rPr/>
             </w:pPr>
             <w:r>
@@ -13936,6 +14468,7 @@
           </w:tcPr>
           <w:p>
             <w:pPr>
+              <w:keepNext/>
               <w:jc w:val="center"/>
               <w:rPr/>
             </w:pPr>
@@ -13964,6 +14497,7 @@
           </w:tcPr>
           <w:p>
             <w:pPr>
+              <w:keepNext/>
               <w:rPr/>
             </w:pPr>
             <w:r>
@@ -13997,6 +14531,7 @@
           </w:tcPr>
           <w:p>
             <w:pPr>
+              <w:keepNext/>
               <w:rPr/>
             </w:pPr>
             <w:r>
@@ -14031,6 +14566,7 @@
           </w:tcPr>
           <w:p>
             <w:pPr>
+              <w:keepNext/>
               <w:rPr/>
             </w:pPr>
             <w:r>
@@ -14065,6 +14601,7 @@
           </w:tcPr>
           <w:p>
             <w:pPr>
+              <w:keepNext/>
               <w:jc w:val="center"/>
               <w:rPr/>
             </w:pPr>
@@ -14093,6 +14630,7 @@
           </w:tcPr>
           <w:p>
             <w:pPr>
+              <w:keepNext/>
               <w:rPr/>
             </w:pPr>
             <w:r>
@@ -14126,6 +14664,7 @@
           </w:tcPr>
           <w:p>
             <w:pPr>
+              <w:keepNext/>
               <w:rPr/>
             </w:pPr>
             <w:r>
@@ -14160,6 +14699,7 @@
           </w:tcPr>
           <w:p>
             <w:pPr>
+              <w:keepNext/>
               <w:rPr/>
             </w:pPr>
             <w:r>
@@ -14194,6 +14734,7 @@
           </w:tcPr>
           <w:p>
             <w:pPr>
+              <w:keepNext/>
               <w:jc w:val="center"/>
               <w:rPr/>
             </w:pPr>
@@ -14222,6 +14763,7 @@
           </w:tcPr>
           <w:p>
             <w:pPr>
+              <w:keepNext/>
               <w:rPr/>
             </w:pPr>
             <w:r>
@@ -14255,6 +14797,7 @@
           </w:tcPr>
           <w:p>
             <w:pPr>
+              <w:keepNext/>
               <w:rPr/>
             </w:pPr>
             <w:r>
@@ -14289,6 +14832,7 @@
           </w:tcPr>
           <w:p>
             <w:pPr>
+              <w:keepNext/>
               <w:rPr/>
             </w:pPr>
             <w:r>
@@ -14323,6 +14867,7 @@
           </w:tcPr>
           <w:p>
             <w:pPr>
+              <w:keepNext/>
               <w:jc w:val="center"/>
               <w:rPr/>
             </w:pPr>
@@ -14351,6 +14896,7 @@
           </w:tcPr>
           <w:p>
             <w:pPr>
+              <w:keepNext/>
               <w:rPr/>
             </w:pPr>
             <w:r>

</xml_diff>